<commit_message>
mnd motion-brief: typst and docx on the shared cross-engine layout model, Times New Roman on both (29.9 pt double pitch, 14.95 pt headings, footnotes and quotations, LR 7.1(h)(1)); the caption's party rules at the row's top and foot in both engines, the footnote entry on its own leading; make-reference.sh and reference.docx give way to docx/reference.xml (base="xengine"); body, quotations and footnotes stay pandoc's (Body Text, Block Text, Footnote Text); docx XENG-001..003 pass, params.cross_engine: gate; typst 9 and docx 13 checks passed, 0 failed (fb-595.68.8)
</commit_message>
<xml_diff>
--- a/courts/eighth-circuit/minnesota/federal/district/motion-brief/usage/OUTPUT-motion-brief.docx
+++ b/courts/eighth-circuit/minnesota/federal/district/motion-brief/usage/OUTPUT-motion-brief.docx
@@ -5,61 +5,46 @@
     <w:p>
       <w:pPr>
         <w:spacing w:before="0" w:after="0" w:line="299" w:lineRule="exact"/>
+        <w:ind w:left="0" w:firstLine="0"/>
         <w:jc w:val="center"/>
       </w:pPr>
       <w:r>
         <w:rPr>
           <w:b/>
           <w:bCs/>
-          <w:sz w:val="26"/>
-          <w:szCs w:val="26"/>
         </w:rPr>
         <w:t xml:space="preserve">UNITED STATES DISTRICT COURT</w:t>
       </w:r>
     </w:p>
     <w:p>
       <w:pPr>
-        <w:spacing w:before="0" w:after="0" w:line="299" w:lineRule="exact"/>
+        <w:spacing w:before="0" w:after="598" w:line="299" w:lineRule="exact"/>
+        <w:ind w:left="0" w:firstLine="0"/>
         <w:jc w:val="center"/>
       </w:pPr>
       <w:r>
         <w:rPr>
           <w:b/>
           <w:bCs/>
-          <w:sz w:val="26"/>
-          <w:szCs w:val="26"/>
         </w:rPr>
         <w:t xml:space="preserve">DISTRICT OF MINNESOTA</w:t>
       </w:r>
-    </w:p>
-    <w:p>
-      <w:pPr>
-        <w:spacing w:before="0" w:after="0" w:line="598" w:lineRule="exact"/>
-      </w:pPr>
     </w:p>
     <w:tbl>
       <w:tblPr>
         <w:tblW w:w="9360" w:type="dxa"/>
-        <w:tblInd w:w="0" w:type="dxa"/>
-        <w:tblBorders>
-          <w:top w:val="nil"/>
-          <w:left w:val="nil"/>
-          <w:bottom w:val="nil"/>
-          <w:right w:val="nil"/>
-          <w:insideH w:val="nil"/>
-          <w:insideV w:val="nil"/>
-        </w:tblBorders>
         <w:tblLayout w:type="fixed"/>
         <w:tblCellMar>
+          <w:top w:w="0" w:type="dxa"/>
           <w:left w:w="0" w:type="dxa"/>
+          <w:bottom w:w="0" w:type="dxa"/>
           <w:right w:w="0" w:type="dxa"/>
         </w:tblCellMar>
-        <w:tblLook w:val="0000"/>
+        <w:tblLook w:val="0000" w:firstRow="0" w:lastRow="0" w:firstColumn="0" w:lastColumn="0" w:noHBand="0" w:noVBand="0"/>
       </w:tblPr>
       <w:tblGrid>
         <w:gridCol w:w="4752"/>
-        <w:gridCol w:w="432"/>
-        <w:gridCol w:w="4176"/>
+        <w:gridCol w:w="4608"/>
       </w:tblGrid>
       <w:tr>
         <w:tc>
@@ -69,140 +54,225 @@
               <w:top w:val="single" w:sz="6" w:space="0" w:color="000000"/>
               <w:bottom w:val="single" w:sz="6" w:space="0" w:color="000000"/>
             </w:tcBorders>
+          </w:tcPr>
+          <w:p>
+            <w:pPr>
+              <w:spacing w:before="160" w:after="0" w:line="299" w:lineRule="exact"/>
+              <w:ind w:left="0" w:firstLine="0"/>
+              <w:jc w:val="left"/>
+            </w:pPr>
+            <w:r>
+              <w:t xml:space="preserve">Eli</w:t>
+            </w:r>
+            <w:r>
+              <w:t xml:space="preserve"> </w:t>
+            </w:r>
+            <w:r>
+              <w:t xml:space="preserve">Adams,</w:t>
+            </w:r>
+            <w:r>
+              <w:t xml:space="preserve"> </w:t>
+            </w:r>
+            <w:r>
+              <w:t xml:space="preserve">an</w:t>
+            </w:r>
+            <w:r>
+              <w:t xml:space="preserve"> </w:t>
+            </w:r>
+            <w:r>
+              <w:t xml:space="preserve">individual,</w:t>
+            </w:r>
+            <w:r>
+              <w:t xml:space="preserve"> </w:t>
+            </w:r>
+            <w:r>
+              <w:t xml:space="preserve">and</w:t>
+            </w:r>
+            <w:r>
+              <w:t xml:space="preserve"> </w:t>
+            </w:r>
+            <w:r>
+              <w:t xml:space="preserve">Reyna</w:t>
+            </w:r>
+            <w:r>
+              <w:t xml:space="preserve"> </w:t>
+            </w:r>
+            <w:r>
+              <w:t xml:space="preserve">Balboa,</w:t>
+            </w:r>
+            <w:r>
+              <w:t xml:space="preserve"> </w:t>
+            </w:r>
+            <w:r>
+              <w:t xml:space="preserve">an</w:t>
+            </w:r>
+            <w:r>
+              <w:t xml:space="preserve"> </w:t>
+            </w:r>
+            <w:r>
+              <w:t xml:space="preserve">individual,</w:t>
+            </w:r>
+          </w:p>
+          <w:p>
+            <w:pPr>
+              <w:spacing w:before="0" w:after="0" w:line="299" w:lineRule="exact"/>
+              <w:ind w:left="1728" w:firstLine="0"/>
+              <w:jc w:val="left"/>
+            </w:pPr>
+            <w:r>
+              <w:t xml:space="preserve">Plaintiffs</w:t>
+            </w:r>
+            <w:r>
+              <w:t xml:space="preserve"> </w:t>
+            </w:r>
+            <w:r>
+              <w:t xml:space="preserve">and</w:t>
+            </w:r>
+            <w:r>
+              <w:t xml:space="preserve"> </w:t>
+            </w:r>
+            <w:r>
+              <w:t xml:space="preserve">Counterclaim</w:t>
+            </w:r>
+            <w:r>
+              <w:t xml:space="preserve"> </w:t>
+            </w:r>
+            <w:r>
+              <w:t xml:space="preserve">Defendants,</w:t>
+            </w:r>
+          </w:p>
+          <w:p>
+            <w:pPr>
+              <w:spacing w:before="0" w:after="0" w:line="299" w:lineRule="exact"/>
+              <w:ind w:left="432" w:firstLine="0"/>
+              <w:jc w:val="left"/>
+            </w:pPr>
+            <w:r>
+              <w:t xml:space="preserve">v.</w:t>
+            </w:r>
+          </w:p>
+          <w:p>
+            <w:pPr>
+              <w:spacing w:before="0" w:after="0" w:line="299" w:lineRule="exact"/>
+              <w:ind w:left="0" w:firstLine="0"/>
+              <w:jc w:val="left"/>
+            </w:pPr>
+            <w:r>
+              <w:t xml:space="preserve">Peter</w:t>
+            </w:r>
+            <w:r>
+              <w:t xml:space="preserve"> </w:t>
+            </w:r>
+            <w:r>
+              <w:t xml:space="preserve">Innes,</w:t>
+            </w:r>
+            <w:r>
+              <w:t xml:space="preserve"> </w:t>
+            </w:r>
+            <w:r>
+              <w:t xml:space="preserve">an</w:t>
+            </w:r>
+            <w:r>
+              <w:t xml:space="preserve"> </w:t>
+            </w:r>
+            <w:r>
+              <w:t xml:space="preserve">individual,</w:t>
+            </w:r>
+          </w:p>
+          <w:p>
+            <w:pPr>
+              <w:spacing w:before="0" w:after="160" w:line="299" w:lineRule="exact"/>
+              <w:ind w:left="1728" w:firstLine="0"/>
+              <w:jc w:val="left"/>
+            </w:pPr>
+            <w:r>
+              <w:t xml:space="preserve">Defendant</w:t>
+            </w:r>
+            <w:r>
+              <w:t xml:space="preserve"> </w:t>
+            </w:r>
+            <w:r>
+              <w:t xml:space="preserve">and</w:t>
+            </w:r>
+            <w:r>
+              <w:t xml:space="preserve"> </w:t>
+            </w:r>
+            <w:r>
+              <w:t xml:space="preserve">Counterclaim</w:t>
+            </w:r>
+            <w:r>
+              <w:t xml:space="preserve"> </w:t>
+            </w:r>
+            <w:r>
+              <w:t xml:space="preserve">Plaintiff.</w:t>
+            </w:r>
+          </w:p>
+        </w:tc>
+        <w:tc>
+          <w:tcPr>
+            <w:tcW w:w="4608" w:type="dxa"/>
             <w:tcMar>
-              <w:top w:w="160" w:type="dxa"/>
-              <w:bottom w:w="160" w:type="dxa"/>
+              <w:left w:w="576" w:type="dxa"/>
             </w:tcMar>
           </w:tcPr>
           <w:p>
             <w:pPr>
-              <w:spacing w:before="0" w:after="130" w:line="299" w:lineRule="exact"/>
+              <w:spacing w:before="160" w:after="0" w:line="299" w:lineRule="exact"/>
+              <w:ind w:left="0" w:firstLine="0"/>
+              <w:jc w:val="left"/>
             </w:pPr>
             <w:r>
-              <w:rPr>
-                <w:sz w:val="26"/>
-                <w:szCs w:val="26"/>
-              </w:rPr>
-              <w:t xml:space="preserve">Eli Adams, an individual, and Reyna Balboa, an individual,</w:t>
+              <w:t xml:space="preserve">Court File No. 0:26-cv</w:t>
+              <w:noBreakHyphen/>
+              <w:t xml:space="preserve">02415-JMB-SGE</w:t>
             </w:r>
           </w:p>
           <w:p>
             <w:pPr>
-              <w:spacing w:before="0" w:after="130" w:line="299" w:lineRule="exact"/>
-              <w:ind w:left="1728"/>
+              <w:spacing w:before="299" w:after="0" w:line="299" w:lineRule="exact"/>
+              <w:ind w:left="0" w:firstLine="0"/>
+              <w:jc w:val="center"/>
             </w:pPr>
             <w:r>
               <w:rPr>
-                <w:sz w:val="26"/>
-                <w:szCs w:val="26"/>
+                <w:b/>
+                <w:bCs/>
               </w:rPr>
-              <w:t xml:space="preserve">Plaintiffs and Counterclaim Defendants,</w:t>
+              <w:t xml:space="preserve">PLAINTIFFS ELI ADAMS AND REYNA BALBOA’S MEMORANDUM IN SUPPORT OF MOTION FOR PARTIAL DISMISSAL OF COUNTERCLAIMS</w:t>
             </w:r>
           </w:p>
           <w:p>
             <w:pPr>
-              <w:spacing w:before="0" w:after="130" w:line="299" w:lineRule="exact"/>
-              <w:ind w:left="432"/>
-            </w:pPr>
-            <w:r>
-              <w:rPr>
-                <w:sz w:val="26"/>
-                <w:szCs w:val="26"/>
-              </w:rPr>
-              <w:t xml:space="preserve">v.</w:t>
-            </w:r>
-          </w:p>
-          <w:p>
-            <w:pPr>
-              <w:spacing w:before="0" w:after="130" w:line="299" w:lineRule="exact"/>
-            </w:pPr>
-            <w:r>
-              <w:rPr>
-                <w:sz w:val="26"/>
-                <w:szCs w:val="26"/>
-              </w:rPr>
-              <w:t xml:space="preserve">Peter Innes, an individual,</w:t>
-            </w:r>
-          </w:p>
-          <w:p>
-            <w:pPr>
-              <w:spacing w:before="0" w:after="0" w:line="299" w:lineRule="exact"/>
-              <w:ind w:left="1728"/>
-            </w:pPr>
-            <w:r>
-              <w:rPr>
-                <w:sz w:val="26"/>
-                <w:szCs w:val="26"/>
-              </w:rPr>
-              <w:t xml:space="preserve">Defendant and Counterclaim Plaintiff.</w:t>
-            </w:r>
-          </w:p>
-        </w:tc>
-        <w:tc>
-          <w:tcPr>
-            <w:tcW w:w="432" w:type="dxa"/>
-          </w:tcPr>
-          <w:p>
-            <w:pPr>
-              <w:spacing w:before="0" w:after="0" w:line="299" w:lineRule="exact"/>
-            </w:pPr>
-          </w:p>
-        </w:tc>
-        <w:tc>
-          <w:tcPr>
-            <w:tcW w:w="4176" w:type="dxa"/>
-            <w:tcMar>
-              <w:left w:w="144" w:type="dxa"/>
-            </w:tcMar>
-          </w:tcPr>
-          <w:p>
-            <w:pPr>
-              <w:spacing w:before="0" w:after="0" w:line="299" w:lineRule="exact"/>
-            </w:pPr>
-            <w:r>
-              <w:rPr>
-                <w:sz w:val="26"/>
-                <w:szCs w:val="26"/>
-              </w:rPr>
-              <w:t xml:space="preserve">Court File No. 0:26-cv-02415-JMB-SGE</w:t>
-            </w:r>
-          </w:p>
-          <w:p>
-            <w:pPr>
-              <w:spacing w:before="0" w:after="0" w:line="598" w:lineRule="exact"/>
-            </w:pPr>
-          </w:p>
-          <w:p>
-            <w:pPr>
-              <w:spacing w:before="0" w:after="0" w:line="299" w:lineRule="exact"/>
-              <w:jc w:val="center"/>
-            </w:pPr>
-            <w:r>
-              <w:rPr>
-                <w:b/>
-                <w:bCs/>
-                <w:sz w:val="26"/>
-                <w:szCs w:val="26"/>
-              </w:rPr>
-              <w:t xml:space="preserve">PLAINTIFFS ELI ADAMS AND REYNA BALBOA’S MEMORANDUM IN SUPPORT OF MOTION FOR PARTIAL DISMISSAL OF COUNTERCLAIMS</w:t>
-            </w:r>
-          </w:p>
-          <w:p>
-            <w:pPr>
-              <w:spacing w:before="0" w:after="0" w:line="598" w:lineRule="exact"/>
-            </w:pPr>
-          </w:p>
-          <w:p>
-            <w:pPr>
-              <w:spacing w:before="0" w:after="0" w:line="299" w:lineRule="exact"/>
+              <w:spacing w:before="299" w:after="0" w:line="299" w:lineRule="exact"/>
+              <w:ind w:left="0" w:firstLine="0"/>
               <w:jc w:val="right"/>
             </w:pPr>
             <w:r>
-              <w:rPr>
-                <w:sz w:val="26"/>
-                <w:szCs w:val="26"/>
-              </w:rPr>
-              <w:t xml:space="preserve">Fed. R. Civ. P. 12(b)(6)</w:t>
+              <w:t xml:space="preserve">Fed.</w:t>
+            </w:r>
+            <w:r>
+              <w:t xml:space="preserve"> </w:t>
+            </w:r>
+            <w:r>
+              <w:t xml:space="preserve">R.</w:t>
+            </w:r>
+            <w:r>
+              <w:t xml:space="preserve"> </w:t>
+            </w:r>
+            <w:r>
+              <w:t xml:space="preserve">Civ.</w:t>
+            </w:r>
+            <w:r>
+              <w:t xml:space="preserve"> </w:t>
+            </w:r>
+            <w:r>
+              <w:t xml:space="preserve">P.</w:t>
+            </w:r>
+            <w:r>
+              <w:t xml:space="preserve"> </w:t>
+            </w:r>
+            <w:r>
+              <w:t xml:space="preserve">12(b)⁠(6)</w:t>
             </w:r>
           </w:p>
         </w:tc>
@@ -210,22 +280,24 @@
     </w:tbl>
     <w:p>
       <w:pPr>
-        <w:spacing w:before="0" w:after="0" w:line="598" w:lineRule="exact"/>
-      </w:pPr>
-    </w:p>
-    <w:p>
-      <w:pPr>
-        <w:pStyle w:val="Heading1"/>
-      </w:pPr>
-      <w:bookmarkStart w:id="9" w:name="_introduction"/>
-      <w:r>
+        <w:keepNext/>
+        <w:keepLines/>
+        <w:spacing w:before="598" w:after="299" w:line="299" w:lineRule="exact"/>
+        <w:ind w:left="0" w:firstLine="0"/>
+        <w:jc w:val="center"/>
+        <w:outlineLvl w:val="0"/>
+      </w:pPr>
+      <w:r>
+        <w:rPr>
+          <w:b/>
+          <w:bCs/>
+        </w:rPr>
         <w:t xml:space="preserve">INTRODUCTION</w:t>
       </w:r>
-      <w:bookmarkEnd w:id="9"/>
-    </w:p>
-    <w:p>
-      <w:pPr>
-        <w:pStyle w:val="FirstParagraph"/>
+    </w:p>
+    <w:p>
+      <w:pPr>
+        <w:pStyle w:val="BodyText"/>
       </w:pPr>
       <w:r>
         <w:t xml:space="preserve">After Peter Innes faced an intense public backlash for accused misconduct, he executed a written Transfer Agreement to sell his Roblox game “</w:t>
@@ -246,25 +318,46 @@
         <w:pStyle w:val="BodyText"/>
       </w:pPr>
       <w:r>
-        <w:t xml:space="preserve">In essence, Innes is asking this Court to apply a special contracting standard for young adults. He wishes he had not executed the Agreement, and now seeks to have the Court unwind everything because he was “just three months past his eighteenth birthday.” (Defendant and Counterclaim Plaintiff Peter Innes’ Amended Answer, Affirmative Defenses, and First Amended Counterclaims (“Am. Answer” or “Am. Countercl.”), Dkt. 34 ¶ 2.) To that end, he has generated 21 causes of action arising from this situation, including facially implausible claims like fraud, defamation, breach of bailment, and conversion. The Court should dismiss these untenable causes of action.</w:t>
-      </w:r>
-    </w:p>
-    <w:p>
-      <w:pPr>
-        <w:pStyle w:val="Heading1"/>
-      </w:pPr>
-      <w:bookmarkStart w:id="10" w:name="_b8e5b8837ccf89115edfee2c48cc11b996d00ec"/>
-      <w:r>
-        <w:t xml:space="preserve">FACTUAL BACKGROUND</w:t>
-      </w:r>
-      <w:bookmarkEnd w:id="10"/>
-    </w:p>
-    <w:p>
-      <w:pPr>
-        <w:pStyle w:val="FirstParagraph"/>
-      </w:pPr>
-      <w:r>
-        <w:t xml:space="preserve">Peter Innes is an adult. (Am. Countercl., Dkt. 34 ¶ 5). Innes created and operated a popular Roblox game called</w:t>
+        <w:t xml:space="preserve">In essence, Innes is asking this Court to apply a special contracting standard for young adults. He wishes he had not executed the Agreement, and now seeks to have the Court unwind everything because he was “just three months past his eighteenth birthday.” (Defendant and Counterclaim Plaintiff Peter Innes’ Amended Answer, Affirmative Defenses, and First Amended Counterclaims (“Am. Answer” or “Am. Countercl.”), Dkt. 34 ¶ 2.) To that end, he has generated 21 causes of action arising from this situation, including facially implausible claims like fraud, defamation, breach of bailment, and conversion. The Court should dismiss these untenable causes of action.</w:t>
+      </w:r>
+    </w:p>
+    <w:p>
+      <w:pPr>
+        <w:keepNext/>
+        <w:keepLines/>
+        <w:spacing w:before="299" w:after="299" w:line="299" w:lineRule="exact"/>
+        <w:ind w:left="0" w:firstLine="0"/>
+        <w:jc w:val="center"/>
+        <w:outlineLvl w:val="0"/>
+      </w:pPr>
+      <w:r>
+        <w:rPr>
+          <w:b/>
+          <w:bCs/>
+        </w:rPr>
+        <w:t xml:space="preserve">FACTUAL</w:t>
+      </w:r>
+      <w:r>
+        <w:rPr>
+          <w:b/>
+          <w:bCs/>
+        </w:rPr>
+        <w:t xml:space="preserve"> </w:t>
+      </w:r>
+      <w:r>
+        <w:rPr>
+          <w:b/>
+          <w:bCs/>
+        </w:rPr>
+        <w:t xml:space="preserve">BACKGROUND</w:t>
+      </w:r>
+    </w:p>
+    <w:p>
+      <w:pPr>
+        <w:pStyle w:val="BodyText"/>
+      </w:pPr>
+      <w:r>
+        <w:t xml:space="preserve">Peter Innes is an adult. (Am. Countercl., Dkt. 34 ¶ 5). Innes created and operated a popular Roblox game called</w:t>
       </w:r>
       <w:r>
         <w:t xml:space="preserve"> </w:t>
@@ -293,7 +386,13 @@
         <w:t xml:space="preserve"> </w:t>
       </w:r>
       <w:r>
-        <w:t xml:space="preserve">¶¶ 36-37.) On January 15, 2025, Innes made Adams a moderator with limited administrative powers on the Forsaken Discord. (</w:t>
+        <w:t xml:space="preserve">¶¶ 36</w:t>
+      </w:r>
+      <w:r>
+        <w:noBreakHyphen/>
+      </w:r>
+      <w:r>
+        <w:t xml:space="preserve">37.) On January 15, 2025, Innes made Adams a moderator with limited administrative powers on the Forsaken Discord. (</w:t>
       </w:r>
       <w:r>
         <w:rPr>
@@ -306,7 +405,7 @@
         <w:t xml:space="preserve"> </w:t>
       </w:r>
       <w:r>
-        <w:t xml:space="preserve">¶ 55.)</w:t>
+        <w:t xml:space="preserve">¶ 55.)</w:t>
       </w:r>
     </w:p>
     <w:p>
@@ -314,7 +413,19 @@
         <w:pStyle w:val="BodyText"/>
       </w:pPr>
       <w:r>
-        <w:t xml:space="preserve">On or about May 20, 2025, after a non-party posted a video to YouTube accusing Innes of “distributing child sexual exploitation material,” Innes found himself at the center of a public campaign demanding that he dissociate from Forsaken and the Forsaken Discord Servers. (Am. Countercl., Dkt. 34 ¶¶ 4-5, 46-50.) Six days later, Innes messaged Adams asking, “do u think i could temporarily give you ownership of the discord servers &amp; stuff[?]” because he felt “like it’d be best if we publicly shifted ownership around for a bit[.]” (</w:t>
+        <w:t xml:space="preserve">On or about May 20, 2025, after a non-party posted a video to YouTube accusing Innes of “distributing child sexual exploitation material,” Innes found himself at the center of a public campaign demanding that he dissociate from Forsaken and the Forsaken Discord Servers. (Am. Countercl., Dkt. 34 ¶¶ 4</w:t>
+      </w:r>
+      <w:r>
+        <w:noBreakHyphen/>
+      </w:r>
+      <w:r>
+        <w:t xml:space="preserve">5, 46</w:t>
+      </w:r>
+      <w:r>
+        <w:noBreakHyphen/>
+      </w:r>
+      <w:r>
+        <w:t xml:space="preserve">50.) Six days later, Innes messaged Adams asking, “do u think i could temporarily give you ownership of the discord servers &amp; stuff[?]” because he felt “like it’d be best if we publicly shifted ownership around for a bit[.]” (</w:t>
       </w:r>
       <w:r>
         <w:rPr>
@@ -327,7 +438,7 @@
         <w:t xml:space="preserve"> </w:t>
       </w:r>
       <w:r>
-        <w:t xml:space="preserve">¶ 58.) Adams agreed; Innes transferred control of the Forsaken Discord to Innes. (</w:t>
+        <w:t xml:space="preserve">¶ 58.) Adams agreed; Innes transferred control of the Forsaken Discord to Innes. (</w:t>
       </w:r>
       <w:r>
         <w:rPr>
@@ -340,7 +451,7 @@
         <w:t xml:space="preserve"> </w:t>
       </w:r>
       <w:r>
-        <w:t xml:space="preserve">¶ 59.) Later that day, Adams posted a message on the Forsaken Discord announcing that “ownership of Forsaken has been transferred to myself [and Balboa].” (</w:t>
+        <w:t xml:space="preserve">¶ 59.) Later that day, Adams posted a message on the Forsaken Discord announcing that “ownership of Forsaken has been transferred to myself [and Balboa].” (</w:t>
       </w:r>
       <w:r>
         <w:rPr>
@@ -353,7 +464,7 @@
         <w:t xml:space="preserve"> </w:t>
       </w:r>
       <w:r>
-        <w:t xml:space="preserve">¶ 62 (italics added).)</w:t>
+        <w:t xml:space="preserve">¶ 62 (italics added).)</w:t>
       </w:r>
     </w:p>
     <w:p>
@@ -361,7 +472,13 @@
         <w:pStyle w:val="BodyText"/>
       </w:pPr>
       <w:r>
-        <w:t xml:space="preserve">Over the next month, the parties negotiated a written agreement. (Am. Countercl., Dkt. 34 ¶¶ 79-86.) On June 29, 2025—more than a month after Innes transferred the Forsaken Discord—he executed the Forsaken Transfer Agreement. (</w:t>
+        <w:t xml:space="preserve">Over the next month, the parties negotiated a written agreement. (Am. Countercl., Dkt. 34 ¶¶ 79</w:t>
+      </w:r>
+      <w:r>
+        <w:noBreakHyphen/>
+      </w:r>
+      <w:r>
+        <w:t xml:space="preserve">86.) On June 29, 2025—more than a month after Innes transferred the Forsaken Discord—he executed the Forsaken Transfer Agreement. (</w:t>
       </w:r>
       <w:r>
         <w:rPr>
@@ -374,7 +491,7 @@
         <w:t xml:space="preserve"> </w:t>
       </w:r>
       <w:r>
-        <w:t xml:space="preserve">¶ 86.) By his own account, Innes reviewed the draft before signing. (</w:t>
+        <w:t xml:space="preserve">¶ 86.) By his own account, Innes reviewed the draft before signing. (</w:t>
       </w:r>
       <w:r>
         <w:rPr>
@@ -387,7 +504,7 @@
         <w:t xml:space="preserve"> </w:t>
       </w:r>
       <w:r>
-        <w:t xml:space="preserve">¶ 87.) He even caught an omission in the draft Agreement based on the parties’ discussion, which was then added. (</w:t>
+        <w:t xml:space="preserve">¶ 87.) He even caught an omission in the draft Agreement based on the parties’ discussion, which was then added. (</w:t>
       </w:r>
       <w:r>
         <w:rPr>
@@ -400,7 +517,7 @@
         <w:t xml:space="preserve"> </w:t>
       </w:r>
       <w:r>
-        <w:t xml:space="preserve">¶ 88.)</w:t>
+        <w:t xml:space="preserve">¶ 88.)</w:t>
       </w:r>
     </w:p>
     <w:p>
@@ -408,7 +525,7 @@
         <w:pStyle w:val="BodyText"/>
       </w:pPr>
       <w:r>
-        <w:t xml:space="preserve">On August 21, 2025, Innes signed an amendment to the Agreement, which added a 20% share of revenue from sales of a Forsaken plush doll to Innes’ payout under the Agreement, and recited that, except as amended, the Transfer Agreement “is unaffected and shall continue in full force and effect in accordance with its terms.” (Am. Answer, Dkt. 34 ¶ 26.) Innes admits that he was paid in connection with the Transfer Amendment. (</w:t>
+        <w:t xml:space="preserve">On August 21, 2025, Innes signed an amendment to the Agreement, which added a 20% share of revenue from sales of a Forsaken plush doll to Innes’ payout under the Agreement, and recited that, except as amended, the Transfer Agreement “is unaffected and shall continue in full force and effect in accordance with its terms.” (Am. Answer, Dkt. 34 ¶ 26.) Innes admits that he was paid in connection with the Transfer Amendment. (</w:t>
       </w:r>
       <w:r>
         <w:rPr>
@@ -421,7 +538,7 @@
         <w:t xml:space="preserve"> </w:t>
       </w:r>
       <w:r>
-        <w:t xml:space="preserve">¶ 28.) He further admits that he directed plaintiffs to pay portions of his revenue share to third parties. (</w:t>
+        <w:t xml:space="preserve">¶ 28.) He further admits that he directed plaintiffs to pay portions of his revenue share to third parties. (</w:t>
       </w:r>
       <w:r>
         <w:rPr>
@@ -434,7 +551,7 @@
         <w:t xml:space="preserve"> </w:t>
       </w:r>
       <w:r>
-        <w:t xml:space="preserve">¶ 27.)</w:t>
+        <w:t xml:space="preserve">¶ 27.)</w:t>
       </w:r>
     </w:p>
     <w:p>
@@ -455,35 +572,78 @@
         <w:t xml:space="preserve"> </w:t>
       </w:r>
       <w:r>
-        <w:t xml:space="preserve">Am. Answer, Dkt. 34 ¶ 34.) He alleges, in part, that: (1) the Agreement was procured by fraud, (2) plaintiffs’ claimed ownership of Forsaken was defamatory, (3) plaintiffs breached their bailment of the Game’s Discord server, (4) plaintiffs converted various servers and online accounts, and (5) plaintiffs owe Innes an accounting.</w:t>
-      </w:r>
-    </w:p>
-    <w:p>
-      <w:pPr>
-        <w:pStyle w:val="Heading1"/>
-      </w:pPr>
-      <w:bookmarkStart w:id="11" w:name="_argument"/>
-      <w:r>
+        <w:t xml:space="preserve">Am. Answer, Dkt. 34 ¶ 34.) He alleges, in part, that: (1) the Agreement was procured by fraud, (2) plaintiffs’ claimed ownership of Forsaken was defamatory, (3) plaintiffs breached their bailment of the Game’s Discord server, (4) plaintiffs converted various servers and online accounts, and (5) plaintiffs owe Innes an accounting.</w:t>
+      </w:r>
+    </w:p>
+    <w:p>
+      <w:pPr>
+        <w:keepNext/>
+        <w:keepLines/>
+        <w:spacing w:before="299" w:after="299" w:line="299" w:lineRule="exact"/>
+        <w:ind w:left="0" w:firstLine="0"/>
+        <w:jc w:val="center"/>
+        <w:outlineLvl w:val="0"/>
+      </w:pPr>
+      <w:r>
+        <w:rPr>
+          <w:b/>
+          <w:bCs/>
+        </w:rPr>
         <w:t xml:space="preserve">ARGUMENT</w:t>
       </w:r>
-      <w:bookmarkEnd w:id="11"/>
     </w:p>
     <w:p>
       <w:pPr>
         <w:pStyle w:val="Heading2"/>
-      </w:pPr>
-      <w:bookmarkStart w:id="12" w:name="_f9f6c47fa7e07f287a053b94854699bf3c88e85"/>
-      <w:r>
-        <w:t xml:space="preserve">I. Legal standards.</w:t>
-      </w:r>
-      <w:bookmarkEnd w:id="12"/>
-    </w:p>
-    <w:p>
-      <w:pPr>
-        <w:pStyle w:val="FirstParagraph"/>
-      </w:pPr>
-      <w:r>
-        <w:t xml:space="preserve">To survive a motion to dismiss under Rule 12(b)(6), “a complaint must contain sufficient factual matter, accepted as true, to state a claim to relief that is plausible on its face.’”</w:t>
+        <w:keepNext/>
+        <w:keepLines/>
+        <w:spacing w:before="299" w:after="299" w:line="299" w:lineRule="exact"/>
+        <w:ind w:left="720" w:hanging="720"/>
+        <w:jc w:val="left"/>
+        <w:outlineLvl w:val="1"/>
+      </w:pPr>
+      <w:r>
+        <w:rPr>
+          <w:b/>
+          <w:bCs/>
+        </w:rPr>
+        <w:t xml:space="preserve">I.</w:t>
+      </w:r>
+      <w:r>
+        <w:rPr>
+          <w:b/>
+          <w:bCs/>
+        </w:rPr>
+        <w:t xml:space="preserve"> </w:t>
+      </w:r>
+      <w:r>
+        <w:rPr>
+          <w:b/>
+          <w:bCs/>
+        </w:rPr>
+        <w:t xml:space="preserve">Legal</w:t>
+      </w:r>
+      <w:r>
+        <w:rPr>
+          <w:b/>
+          <w:bCs/>
+        </w:rPr>
+        <w:t xml:space="preserve"> </w:t>
+      </w:r>
+      <w:r>
+        <w:rPr>
+          <w:b/>
+          <w:bCs/>
+        </w:rPr>
+        <w:t xml:space="preserve">standards.</w:t>
+      </w:r>
+    </w:p>
+    <w:p>
+      <w:pPr>
+        <w:pStyle w:val="BodyText"/>
+      </w:pPr>
+      <w:r>
+        <w:t xml:space="preserve">To survive a motion to dismiss under Rule 12(b)⁠(6), “a complaint must contain sufficient factual matter, accepted as true, to state a claim to relief that is plausible on its face.’”</w:t>
       </w:r>
       <w:r>
         <w:t xml:space="preserve"> </w:t>
@@ -582,7 +742,7 @@
           <w:i/>
           <w:iCs/>
         </w:rPr>
-        <w:t xml:space="preserve">Schaller Tel. Co. v. Golden Sky Sys., Inc.</w:t>
+        <w:t xml:space="preserve">Schaller Tel. Co. v. Golden Sky Sys., Inc.</w:t>
       </w:r>
       <w:r>
         <w:t xml:space="preserve">, 298 F.3d 736, 746 (8th Cir. 2002)). “In other words, the complaint must plead the ‘who, what, where, when, and how of the alleged fraud.’”</w:t>
@@ -611,7 +771,7 @@
           <w:i/>
           <w:iCs/>
         </w:rPr>
-        <w:t xml:space="preserve">United States ex rel. Joshi v. St. Luke’s Hosp., Inc.</w:t>
+        <w:t xml:space="preserve">United States ex rel. Joshi v. St. Luke’s Hosp., Inc.</w:t>
       </w:r>
       <w:r>
         <w:t xml:space="preserve">, 441 F.3d 552, 556 (8th Cir. 2006)).</w:t>
@@ -620,29 +780,191 @@
     <w:p>
       <w:pPr>
         <w:pStyle w:val="Heading2"/>
-      </w:pPr>
-      <w:bookmarkStart w:id="13" w:name="_5b885570ef6e85d558e2663d547f69eb9ad524a"/>
-      <w:r>
-        <w:t xml:space="preserve">II. The challenged counterclaims are insufficiently pled.</w:t>
-      </w:r>
-      <w:bookmarkEnd w:id="13"/>
+        <w:keepNext/>
+        <w:keepLines/>
+        <w:spacing w:before="299" w:after="299" w:line="299" w:lineRule="exact"/>
+        <w:ind w:left="720" w:hanging="720"/>
+        <w:jc w:val="left"/>
+        <w:outlineLvl w:val="1"/>
+      </w:pPr>
+      <w:r>
+        <w:rPr>
+          <w:b/>
+          <w:bCs/>
+        </w:rPr>
+        <w:t xml:space="preserve">II.</w:t>
+      </w:r>
+      <w:r>
+        <w:rPr>
+          <w:b/>
+          <w:bCs/>
+        </w:rPr>
+        <w:t xml:space="preserve"> </w:t>
+      </w:r>
+      <w:r>
+        <w:rPr>
+          <w:b/>
+          <w:bCs/>
+        </w:rPr>
+        <w:t xml:space="preserve">The</w:t>
+      </w:r>
+      <w:r>
+        <w:rPr>
+          <w:b/>
+          <w:bCs/>
+        </w:rPr>
+        <w:t xml:space="preserve"> </w:t>
+      </w:r>
+      <w:r>
+        <w:rPr>
+          <w:b/>
+          <w:bCs/>
+        </w:rPr>
+        <w:t xml:space="preserve">challenged</w:t>
+      </w:r>
+      <w:r>
+        <w:rPr>
+          <w:b/>
+          <w:bCs/>
+        </w:rPr>
+        <w:t xml:space="preserve"> </w:t>
+      </w:r>
+      <w:r>
+        <w:rPr>
+          <w:b/>
+          <w:bCs/>
+        </w:rPr>
+        <w:t xml:space="preserve">counterclaims</w:t>
+      </w:r>
+      <w:r>
+        <w:rPr>
+          <w:b/>
+          <w:bCs/>
+        </w:rPr>
+        <w:t xml:space="preserve"> </w:t>
+      </w:r>
+      <w:r>
+        <w:rPr>
+          <w:b/>
+          <w:bCs/>
+        </w:rPr>
+        <w:t xml:space="preserve">are</w:t>
+      </w:r>
+      <w:r>
+        <w:rPr>
+          <w:b/>
+          <w:bCs/>
+        </w:rPr>
+        <w:t xml:space="preserve"> </w:t>
+      </w:r>
+      <w:r>
+        <w:rPr>
+          <w:b/>
+          <w:bCs/>
+        </w:rPr>
+        <w:t xml:space="preserve">insufficiently</w:t>
+      </w:r>
+      <w:r>
+        <w:rPr>
+          <w:b/>
+          <w:bCs/>
+        </w:rPr>
+        <w:t xml:space="preserve"> </w:t>
+      </w:r>
+      <w:r>
+        <w:rPr>
+          <w:b/>
+          <w:bCs/>
+        </w:rPr>
+        <w:t xml:space="preserve">pled.</w:t>
+      </w:r>
     </w:p>
     <w:p>
       <w:pPr>
         <w:pStyle w:val="Heading3"/>
-      </w:pPr>
-      <w:bookmarkStart w:id="14" w:name="_1c8bb0ee71b3b03bdcf668857f7a9b6fd389090"/>
-      <w:r>
-        <w:t xml:space="preserve">A. Count II and VIII: Fraud.</w:t>
-      </w:r>
-      <w:bookmarkEnd w:id="14"/>
-    </w:p>
-    <w:p>
-      <w:pPr>
-        <w:pStyle w:val="FirstParagraph"/>
-      </w:pPr>
-      <w:r>
-        <w:t xml:space="preserve">Innes asserts the same theory of fraud in two different counts, seeking to rescind the Transfer Agreement on the basis of fraud and also as a standalone claim. (Am. Countercl., Dkt. 34 ¶¶ 123 A, 153-58.) Both attempts fail.</w:t>
+        <w:keepNext/>
+        <w:keepLines/>
+        <w:spacing w:before="299" w:after="299" w:line="299" w:lineRule="exact"/>
+        <w:ind w:left="1440" w:hanging="720"/>
+        <w:jc w:val="left"/>
+        <w:outlineLvl w:val="2"/>
+      </w:pPr>
+      <w:r>
+        <w:rPr>
+          <w:b/>
+          <w:bCs/>
+        </w:rPr>
+        <w:t xml:space="preserve">A.</w:t>
+      </w:r>
+      <w:r>
+        <w:rPr>
+          <w:b/>
+          <w:bCs/>
+        </w:rPr>
+        <w:t xml:space="preserve"> </w:t>
+      </w:r>
+      <w:r>
+        <w:rPr>
+          <w:b/>
+          <w:bCs/>
+        </w:rPr>
+        <w:t xml:space="preserve">Count</w:t>
+      </w:r>
+      <w:r>
+        <w:rPr>
+          <w:b/>
+          <w:bCs/>
+        </w:rPr>
+        <w:t xml:space="preserve"> </w:t>
+      </w:r>
+      <w:r>
+        <w:rPr>
+          <w:b/>
+          <w:bCs/>
+        </w:rPr>
+        <w:t xml:space="preserve">II</w:t>
+      </w:r>
+      <w:r>
+        <w:rPr>
+          <w:b/>
+          <w:bCs/>
+        </w:rPr>
+        <w:t xml:space="preserve"> </w:t>
+      </w:r>
+      <w:r>
+        <w:rPr>
+          <w:b/>
+          <w:bCs/>
+        </w:rPr>
+        <w:t xml:space="preserve">and</w:t>
+      </w:r>
+      <w:r>
+        <w:rPr>
+          <w:b/>
+          <w:bCs/>
+        </w:rPr>
+        <w:t xml:space="preserve"> </w:t>
+      </w:r>
+      <w:r>
+        <w:rPr>
+          <w:b/>
+          <w:bCs/>
+        </w:rPr>
+        <w:t xml:space="preserve">VIII:</w:t>
+      </w:r>
+      <w:r>
+        <w:rPr>
+          <w:b/>
+          <w:bCs/>
+        </w:rPr>
+        <w:t xml:space="preserve"> </w:t>
+      </w:r>
+      <w:r>
+        <w:rPr>
+          <w:b/>
+          <w:bCs/>
+        </w:rPr>
+        <w:t xml:space="preserve">Fraud.</w:t>
       </w:r>
     </w:p>
     <w:p>
@@ -650,13 +972,27 @@
         <w:pStyle w:val="BodyText"/>
       </w:pPr>
       <w:r>
+        <w:t xml:space="preserve">Innes asserts the same theory of fraud in two different counts, seeking to rescind the Transfer Agreement on the basis of fraud and also as a standalone claim. (Am. Countercl., Dkt. 34 ¶¶ 123 A, 153</w:t>
+      </w:r>
+      <w:r>
+        <w:noBreakHyphen/>
+      </w:r>
+      <w:r>
+        <w:t xml:space="preserve">58.) Both attempts fail.</w:t>
+      </w:r>
+    </w:p>
+    <w:p>
+      <w:pPr>
+        <w:pStyle w:val="BodyText"/>
+      </w:pPr>
+      <w:r>
         <w:t xml:space="preserve">In Minnesota,</w:t>
       </w:r>
       <w:r>
         <w:rPr>
           <w:rStyle w:val="FootnoteReference"/>
         </w:rPr>
-        <w:footnoteReference w:id="15"/>
+        <w:footnoteReference w:id="9"/>
       </w:r>
       <w:r>
         <w:t xml:space="preserve"> </w:t>
@@ -746,7 +1082,7 @@
         <w:pStyle w:val="BodyText"/>
       </w:pPr>
       <w:r>
-        <w:t xml:space="preserve">Although the fraud claim is alleged against both Adams and Balboa, there are no allegations regarding Balboa’s alleged representations. Instead, the fraud claim alleges that Adams made representations regarding the Forsaken Discord Servers then jumps to alleging that “Adams and Balboa then used their wrongfully obtained control of the Forsaken Discord Servers to coerce Peter into executing the Transfer Agreement and surrendering Forsaken.” (Am. Countercl., Dkt. 34 ¶ 157.) The fraud claims against Balboa—which allege no representations by her—are therefore insufficiently pled and must be dismissed.</w:t>
+        <w:t xml:space="preserve">Although the fraud claim is alleged against both Adams and Balboa, there are no allegations regarding Balboa’s alleged representations. Instead, the fraud claim alleges that Adams made representations regarding the Forsaken Discord Servers then jumps to alleging that “Adams and Balboa then used their wrongfully obtained control of the Forsaken Discord Servers to coerce Peter into executing the Transfer Agreement and surrendering Forsaken.” (Am. Countercl., Dkt. 34 ¶ 157.) The fraud claims against Balboa—which allege no representations by her—are therefore insufficiently pled and must be dismissed.</w:t>
       </w:r>
     </w:p>
     <w:p>
@@ -754,7 +1090,7 @@
         <w:pStyle w:val="BodyText"/>
       </w:pPr>
       <w:r>
-        <w:t xml:space="preserve">With respect to Adams, Innes alleges just a single misrepresentation: that on May 26, 2025, Adams allegedly represented to Innes that the transfer of control over the Forsaken Discord Servers would be temporary. (Am. Countercl., Dkt. 34 ¶¶ 123 A, 1.) Innes then alleges that the Transfer Agreement—which happened over a month later—was purportedly “procured by fraud.” (Am. Countercl., Dkt. 34 ¶ 123 A.) But he does not allege facts demonstrating reliance on the purported misrepresentation in executing the Transfer Agreement; he merely alleges reliance as a conclusory matter. (Am. Countercl. ¶ 123 A.)</w:t>
+        <w:t xml:space="preserve">With respect to Adams, Innes alleges just a single misrepresentation: that on May 26, 2025, Adams allegedly represented to Innes that the transfer of control over the Forsaken Discord Servers would be temporary. (Am. Countercl., Dkt. 34 ¶¶ 123 A, 1.) Innes then alleges that the Transfer Agreement—which happened over a month later—was purportedly “procured by fraud.” (Am. Countercl., Dkt. 34 ¶ 123 A.) But he does not allege facts demonstrating reliance on the purported misrepresentation in executing the Transfer Agreement; he merely alleges reliance as a conclusory matter. (Am. Countercl. ¶ 123 A.)</w:t>
       </w:r>
     </w:p>
     <w:p>
@@ -762,17 +1098,23 @@
         <w:pStyle w:val="BodyText"/>
       </w:pPr>
       <w:r>
-        <w:t xml:space="preserve">Nor could he allege as much. Innes alleges that Adams and Balboa made “clear that they [had] no intention” of returning the Discord Servers “[j]ust over two hours” after the Discord Servers were transferred. (Am. Countercl., Dkt. 34 ¶¶ 62-64.) And he admits that the Transfer Agreement was executed over a month after he transferred control of the Discord Servers. (Am. Answer, Dkt. 34 ¶ 21.) So, he cannot have relied on the alleged misrepresentation when he executed the Transfer Agreement because he alleges that he knew about the alleged misrepresentation at the time.</w:t>
-      </w:r>
-      <w:r>
-        <w:t xml:space="preserve"> </w:t>
-      </w:r>
-      <w:r>
-        <w:rPr>
-          <w:i/>
-          <w:iCs/>
-        </w:rPr>
-        <w:t xml:space="preserve">See Hoyt Props., Inc. v. Prod. Res. Grp., L.L.C.</w:t>
+        <w:t xml:space="preserve">Nor could he allege as much. Innes alleges that Adams and Balboa made “clear that they [had] no intention” of returning the Discord Servers “[j]ust over two hours” after the Discord Servers were transferred. (Am. Countercl., Dkt. 34 ¶¶ 62</w:t>
+      </w:r>
+      <w:r>
+        <w:noBreakHyphen/>
+      </w:r>
+      <w:r>
+        <w:t xml:space="preserve">64.) And he admits that the Transfer Agreement was executed over a month after he transferred control of the Discord Servers. (Am. Answer, Dkt. 34 ¶ 21.) So, he cannot have relied on the alleged misrepresentation when he executed the Transfer Agreement because he alleges that he knew about the alleged misrepresentation at the time.</w:t>
+      </w:r>
+      <w:r>
+        <w:t xml:space="preserve"> </w:t>
+      </w:r>
+      <w:r>
+        <w:rPr>
+          <w:i/>
+          <w:iCs/>
+        </w:rPr>
+        <w:t xml:space="preserve">See Hoyt Props., Inc. v. Prod. Res. Grp., L.L.C.</w:t>
       </w:r>
       <w:r>
         <w:t xml:space="preserve">, 736 N.W.2d 313, 321 (Minn. 2007) (“. . . a party can reasonably rely on a representation unless the falsity of the representation is known or obvious to the listener.”). Innes’ fraud claims should be dismissed as a matter of law.</w:t>
@@ -781,19 +1123,69 @@
     <w:p>
       <w:pPr>
         <w:pStyle w:val="Heading3"/>
-      </w:pPr>
-      <w:bookmarkStart w:id="16" w:name="_52e6a66715b81cf2fc21b9f3b292c8069642249"/>
-      <w:r>
-        <w:t xml:space="preserve">B. Count XIII: Defamation.</w:t>
-      </w:r>
-      <w:bookmarkEnd w:id="16"/>
-    </w:p>
-    <w:p>
-      <w:pPr>
-        <w:pStyle w:val="FirstParagraph"/>
-      </w:pPr>
-      <w:r>
-        <w:t xml:space="preserve">For his defamation counterclaim, Innes alleges that “Adams permanently removed [Innes] from the Forsaken Discord Servers, and posted a message to the entire Server, falsely announcing that [Innes] had transferred the Forsaken Property to [Adams and Balboa] to the Forsaken community[.]” (Am. Countercl., Dkt. 34, ¶ 62.) “Adams’ May 26, 2025 public statements asserting that ownership and control of Forsaken had transferred to Adams and Balboa were false and defamatory.” (</w:t>
+        <w:keepNext/>
+        <w:keepLines/>
+        <w:spacing w:before="299" w:after="299" w:line="299" w:lineRule="exact"/>
+        <w:ind w:left="1440" w:hanging="720"/>
+        <w:jc w:val="left"/>
+        <w:outlineLvl w:val="2"/>
+      </w:pPr>
+      <w:r>
+        <w:rPr>
+          <w:b/>
+          <w:bCs/>
+        </w:rPr>
+        <w:t xml:space="preserve">B.</w:t>
+      </w:r>
+      <w:r>
+        <w:rPr>
+          <w:b/>
+          <w:bCs/>
+        </w:rPr>
+        <w:t xml:space="preserve"> </w:t>
+      </w:r>
+      <w:r>
+        <w:rPr>
+          <w:b/>
+          <w:bCs/>
+        </w:rPr>
+        <w:t xml:space="preserve">Count</w:t>
+      </w:r>
+      <w:r>
+        <w:rPr>
+          <w:b/>
+          <w:bCs/>
+        </w:rPr>
+        <w:t xml:space="preserve"> </w:t>
+      </w:r>
+      <w:r>
+        <w:rPr>
+          <w:b/>
+          <w:bCs/>
+        </w:rPr>
+        <w:t xml:space="preserve">XIII:</w:t>
+      </w:r>
+      <w:r>
+        <w:rPr>
+          <w:b/>
+          <w:bCs/>
+        </w:rPr>
+        <w:t xml:space="preserve"> </w:t>
+      </w:r>
+      <w:r>
+        <w:rPr>
+          <w:b/>
+          <w:bCs/>
+        </w:rPr>
+        <w:t xml:space="preserve">Defamation.</w:t>
+      </w:r>
+    </w:p>
+    <w:p>
+      <w:pPr>
+        <w:pStyle w:val="BodyText"/>
+      </w:pPr>
+      <w:r>
+        <w:t xml:space="preserve">For his defamation counterclaim, Innes alleges that “Adams permanently removed [Innes] from the Forsaken Discord Servers, and posted a message to the entire Server, falsely announcing that [Innes] had transferred the Forsaken Property to [Adams and Balboa] to the Forsaken community[.]” (Am. Countercl., Dkt. 34, ¶ 62.) “Adams’ May 26, 2025 public statements asserting that ownership and control of Forsaken had transferred to Adams and Balboa were false and defamatory.” (</w:t>
       </w:r>
       <w:r>
         <w:rPr>
@@ -806,7 +1198,7 @@
         <w:t xml:space="preserve"> </w:t>
       </w:r>
       <w:r>
-        <w:t xml:space="preserve">¶ 189.) That portion of the defamation counterclaim should be dismissed.</w:t>
+        <w:t xml:space="preserve">¶ 189.) That portion of the defamation counterclaim should be dismissed.</w:t>
       </w:r>
     </w:p>
     <w:p>
@@ -940,19 +1332,89 @@
     <w:p>
       <w:pPr>
         <w:pStyle w:val="Heading3"/>
-      </w:pPr>
-      <w:bookmarkStart w:id="17" w:name="_8bf93faf6057fffc310fc82f8d6af5e690bd48b"/>
-      <w:r>
-        <w:t xml:space="preserve">C. Count IV: Breach of Bailment.</w:t>
-      </w:r>
-      <w:bookmarkEnd w:id="17"/>
-    </w:p>
-    <w:p>
-      <w:pPr>
-        <w:pStyle w:val="FirstParagraph"/>
-      </w:pPr>
-      <w:r>
-        <w:t xml:space="preserve">Innes next alleges that Adams and Balboa breached obligations of a bailment, on the theory that Innes temporarily gave control of the Forsaken Discord Servers to Adams, therefore making Adams a bailee. (Am. Countercl., Dkt. 34 ¶¶ 133-34.) This claim should be dismissed.</w:t>
+        <w:keepNext/>
+        <w:keepLines/>
+        <w:spacing w:before="299" w:after="299" w:line="299" w:lineRule="exact"/>
+        <w:ind w:left="1440" w:hanging="720"/>
+        <w:jc w:val="left"/>
+        <w:outlineLvl w:val="2"/>
+      </w:pPr>
+      <w:r>
+        <w:rPr>
+          <w:b/>
+          <w:bCs/>
+        </w:rPr>
+        <w:t xml:space="preserve">C.</w:t>
+      </w:r>
+      <w:r>
+        <w:rPr>
+          <w:b/>
+          <w:bCs/>
+        </w:rPr>
+        <w:t xml:space="preserve"> </w:t>
+      </w:r>
+      <w:r>
+        <w:rPr>
+          <w:b/>
+          <w:bCs/>
+        </w:rPr>
+        <w:t xml:space="preserve">Count</w:t>
+      </w:r>
+      <w:r>
+        <w:rPr>
+          <w:b/>
+          <w:bCs/>
+        </w:rPr>
+        <w:t xml:space="preserve"> </w:t>
+      </w:r>
+      <w:r>
+        <w:rPr>
+          <w:b/>
+          <w:bCs/>
+        </w:rPr>
+        <w:t xml:space="preserve">IV:</w:t>
+      </w:r>
+      <w:r>
+        <w:rPr>
+          <w:b/>
+          <w:bCs/>
+        </w:rPr>
+        <w:t xml:space="preserve"> </w:t>
+      </w:r>
+      <w:r>
+        <w:rPr>
+          <w:b/>
+          <w:bCs/>
+        </w:rPr>
+        <w:t xml:space="preserve">Breach</w:t>
+      </w:r>
+      <w:r>
+        <w:rPr>
+          <w:b/>
+          <w:bCs/>
+        </w:rPr>
+        <w:t xml:space="preserve"> </w:t>
+      </w:r>
+      <w:r>
+        <w:rPr>
+          <w:b/>
+          <w:bCs/>
+        </w:rPr>
+        <w:t xml:space="preserve">of</w:t>
+      </w:r>
+      <w:r>
+        <w:rPr>
+          <w:b/>
+          <w:bCs/>
+        </w:rPr>
+        <w:t xml:space="preserve"> </w:t>
+      </w:r>
+      <w:r>
+        <w:rPr>
+          <w:b/>
+          <w:bCs/>
+        </w:rPr>
+        <w:t xml:space="preserve">Bailment.</w:t>
       </w:r>
     </w:p>
     <w:p>
@@ -960,6 +1422,20 @@
         <w:pStyle w:val="BodyText"/>
       </w:pPr>
       <w:r>
+        <w:t xml:space="preserve">Innes next alleges that Adams and Balboa breached obligations of a bailment, on the theory that Innes temporarily gave control of the Forsaken Discord Servers to Adams, therefore making Adams a bailee. (Am. Countercl., Dkt. 34 ¶¶ 133</w:t>
+      </w:r>
+      <w:r>
+        <w:noBreakHyphen/>
+      </w:r>
+      <w:r>
+        <w:t xml:space="preserve">34.) This claim should be dismissed.</w:t>
+      </w:r>
+    </w:p>
+    <w:p>
+      <w:pPr>
+        <w:pStyle w:val="BodyText"/>
+      </w:pPr>
+      <w:r>
         <w:t xml:space="preserve">“A bailment occurs when goods are delivered, without transferal of ownership, under an express or implied agreement that the goods will be returned.”</w:t>
       </w:r>
       <w:r>
@@ -1017,10 +1493,16 @@
           <w:i/>
           <w:iCs/>
         </w:rPr>
-        <w:t xml:space="preserve">Nat’l Fire Ins. Co. v. Commodore Hotel, Inc.</w:t>
-      </w:r>
-      <w:r>
-        <w:t xml:space="preserve">, 107 N.W.2d 708, 709 (Minn. 1961) (emphasis added). Though “goods” has never been expressly defined, the plain meaning of this term does not extend to a Discord server. For example, the term “goods” as used in Minnesota’s Uniform Commercial Code (“UCC”) means things “which are movable at the time of identification to the contract for sale other than the money in which the price is to be paid, investment securities (article 8) and things in action.” Minn. Stat. § 336.2-105(1). Consistent with that UCC definition, Minnesota’s appellate courts have found grain (</w:t>
+        <w:t xml:space="preserve">Nat’l Fire Ins. Co. v. Commodore Hotel, Inc.</w:t>
+      </w:r>
+      <w:r>
+        <w:t xml:space="preserve">, 107 N.W.2d 708, 709 (Minn. 1961) (emphasis added). Though “goods” has never been expressly defined, the plain meaning of this term does not extend to a Discord server. For example, the term “goods” as used in Minnesota’s Uniform Commercial Code (“UCC”) means things “which are movable at the time of identification to the contract for sale other than the money in which the price is to be paid, investment securities (article 8) and things in action.” Minn. Stat. § 336.2</w:t>
+      </w:r>
+      <w:r>
+        <w:noBreakHyphen/>
+      </w:r>
+      <w:r>
+        <w:t xml:space="preserve">105(1). Consistent with that UCC definition, Minnesota’s appellate courts have found grain (</w:t>
       </w:r>
       <w:r>
         <w:rPr>
@@ -1061,25 +1543,285 @@
         <w:t xml:space="preserve"> </w:t>
       </w:r>
       <w:r>
-        <w:t xml:space="preserve">Am. Countercl., Dkt. 34 ¶ 115 (alleging that plaintiffs took “administrative control” of the “server”)). Thus, under Minnesota bailment law, a Discord server does not constitute a “good.” The Court should therefore dismiss Count IV.</w:t>
+        <w:t xml:space="preserve">Am. Countercl., Dkt. 34 ¶ 115 (alleging that plaintiffs took “administrative control” of the “server”)). Thus, under Minnesota bailment law, a Discord server does not constitute a “good.” The Court should therefore dismiss Count IV.</w:t>
       </w:r>
     </w:p>
     <w:p>
       <w:pPr>
         <w:pStyle w:val="Heading3"/>
-      </w:pPr>
-      <w:bookmarkStart w:id="18" w:name="_7aec7bdaadf0e5abbd1b4e2bd9be5f48ba7650e"/>
-      <w:r>
-        <w:t xml:space="preserve">D. Counts IX, X, and XI: Conversion of Forsaken Discord Servers, Roblox Group, Associated Accounts, and the Spectre Account.</w:t>
-      </w:r>
-      <w:bookmarkEnd w:id="18"/>
-    </w:p>
-    <w:p>
-      <w:pPr>
-        <w:pStyle w:val="FirstParagraph"/>
-      </w:pPr>
-      <w:r>
-        <w:t xml:space="preserve">Innes “alleges that Adams and Balboa converted the Forsaken Discord Servers.” (Am. Countercl, Dkt. 34 ¶ 160.) He also alleges that plaintiffs converted the “Forsaken Roblox Group, the Group Owner account, and the associated operating accounts.” (</w:t>
+        <w:keepNext/>
+        <w:keepLines/>
+        <w:spacing w:before="299" w:after="299" w:line="299" w:lineRule="exact"/>
+        <w:ind w:left="1440" w:hanging="720"/>
+        <w:jc w:val="left"/>
+        <w:outlineLvl w:val="2"/>
+      </w:pPr>
+      <w:r>
+        <w:rPr>
+          <w:b/>
+          <w:bCs/>
+        </w:rPr>
+        <w:t xml:space="preserve">D.</w:t>
+      </w:r>
+      <w:r>
+        <w:rPr>
+          <w:b/>
+          <w:bCs/>
+        </w:rPr>
+        <w:t xml:space="preserve"> </w:t>
+      </w:r>
+      <w:r>
+        <w:rPr>
+          <w:b/>
+          <w:bCs/>
+        </w:rPr>
+        <w:t xml:space="preserve">Counts</w:t>
+      </w:r>
+      <w:r>
+        <w:rPr>
+          <w:b/>
+          <w:bCs/>
+        </w:rPr>
+        <w:t xml:space="preserve"> </w:t>
+      </w:r>
+      <w:r>
+        <w:rPr>
+          <w:b/>
+          <w:bCs/>
+        </w:rPr>
+        <w:t xml:space="preserve">IX,</w:t>
+      </w:r>
+      <w:r>
+        <w:rPr>
+          <w:b/>
+          <w:bCs/>
+        </w:rPr>
+        <w:t xml:space="preserve"> </w:t>
+      </w:r>
+      <w:r>
+        <w:rPr>
+          <w:b/>
+          <w:bCs/>
+        </w:rPr>
+        <w:t xml:space="preserve">X,</w:t>
+      </w:r>
+      <w:r>
+        <w:rPr>
+          <w:b/>
+          <w:bCs/>
+        </w:rPr>
+        <w:t xml:space="preserve"> </w:t>
+      </w:r>
+      <w:r>
+        <w:rPr>
+          <w:b/>
+          <w:bCs/>
+        </w:rPr>
+        <w:t xml:space="preserve">and</w:t>
+      </w:r>
+      <w:r>
+        <w:rPr>
+          <w:b/>
+          <w:bCs/>
+        </w:rPr>
+        <w:t xml:space="preserve"> </w:t>
+      </w:r>
+      <w:r>
+        <w:rPr>
+          <w:b/>
+          <w:bCs/>
+        </w:rPr>
+        <w:t xml:space="preserve">XI:</w:t>
+      </w:r>
+      <w:r>
+        <w:rPr>
+          <w:b/>
+          <w:bCs/>
+        </w:rPr>
+        <w:t xml:space="preserve"> </w:t>
+      </w:r>
+      <w:r>
+        <w:rPr>
+          <w:b/>
+          <w:bCs/>
+        </w:rPr>
+        <w:t xml:space="preserve">Conversion</w:t>
+      </w:r>
+      <w:r>
+        <w:rPr>
+          <w:b/>
+          <w:bCs/>
+        </w:rPr>
+        <w:t xml:space="preserve"> </w:t>
+      </w:r>
+      <w:r>
+        <w:rPr>
+          <w:b/>
+          <w:bCs/>
+        </w:rPr>
+        <w:t xml:space="preserve">of</w:t>
+      </w:r>
+      <w:r>
+        <w:rPr>
+          <w:b/>
+          <w:bCs/>
+        </w:rPr>
+        <w:t xml:space="preserve"> </w:t>
+      </w:r>
+      <w:r>
+        <w:rPr>
+          <w:b/>
+          <w:bCs/>
+        </w:rPr>
+        <w:t xml:space="preserve">Forsaken</w:t>
+      </w:r>
+      <w:r>
+        <w:rPr>
+          <w:b/>
+          <w:bCs/>
+        </w:rPr>
+        <w:t xml:space="preserve"> </w:t>
+      </w:r>
+      <w:r>
+        <w:rPr>
+          <w:b/>
+          <w:bCs/>
+        </w:rPr>
+        <w:t xml:space="preserve">Discord</w:t>
+      </w:r>
+      <w:r>
+        <w:rPr>
+          <w:b/>
+          <w:bCs/>
+        </w:rPr>
+        <w:t xml:space="preserve"> </w:t>
+      </w:r>
+      <w:r>
+        <w:rPr>
+          <w:b/>
+          <w:bCs/>
+        </w:rPr>
+        <w:t xml:space="preserve">Servers,</w:t>
+      </w:r>
+      <w:r>
+        <w:rPr>
+          <w:b/>
+          <w:bCs/>
+        </w:rPr>
+        <w:t xml:space="preserve"> </w:t>
+      </w:r>
+      <w:r>
+        <w:rPr>
+          <w:b/>
+          <w:bCs/>
+        </w:rPr>
+        <w:t xml:space="preserve">Roblox</w:t>
+      </w:r>
+      <w:r>
+        <w:rPr>
+          <w:b/>
+          <w:bCs/>
+        </w:rPr>
+        <w:t xml:space="preserve"> </w:t>
+      </w:r>
+      <w:r>
+        <w:rPr>
+          <w:b/>
+          <w:bCs/>
+        </w:rPr>
+        <w:t xml:space="preserve">Group,</w:t>
+      </w:r>
+      <w:r>
+        <w:rPr>
+          <w:b/>
+          <w:bCs/>
+        </w:rPr>
+        <w:t xml:space="preserve"> </w:t>
+      </w:r>
+      <w:r>
+        <w:rPr>
+          <w:b/>
+          <w:bCs/>
+        </w:rPr>
+        <w:t xml:space="preserve">Associated</w:t>
+      </w:r>
+      <w:r>
+        <w:rPr>
+          <w:b/>
+          <w:bCs/>
+        </w:rPr>
+        <w:t xml:space="preserve"> </w:t>
+      </w:r>
+      <w:r>
+        <w:rPr>
+          <w:b/>
+          <w:bCs/>
+        </w:rPr>
+        <w:t xml:space="preserve">Accounts,</w:t>
+      </w:r>
+      <w:r>
+        <w:rPr>
+          <w:b/>
+          <w:bCs/>
+        </w:rPr>
+        <w:t xml:space="preserve"> </w:t>
+      </w:r>
+      <w:r>
+        <w:rPr>
+          <w:b/>
+          <w:bCs/>
+        </w:rPr>
+        <w:t xml:space="preserve">and</w:t>
+      </w:r>
+      <w:r>
+        <w:rPr>
+          <w:b/>
+          <w:bCs/>
+        </w:rPr>
+        <w:t xml:space="preserve"> </w:t>
+      </w:r>
+      <w:r>
+        <w:rPr>
+          <w:b/>
+          <w:bCs/>
+        </w:rPr>
+        <w:t xml:space="preserve">the</w:t>
+      </w:r>
+      <w:r>
+        <w:rPr>
+          <w:b/>
+          <w:bCs/>
+        </w:rPr>
+        <w:t xml:space="preserve"> </w:t>
+      </w:r>
+      <w:r>
+        <w:rPr>
+          <w:b/>
+          <w:bCs/>
+        </w:rPr>
+        <w:t xml:space="preserve">Spectre</w:t>
+      </w:r>
+      <w:r>
+        <w:rPr>
+          <w:b/>
+          <w:bCs/>
+        </w:rPr>
+        <w:t xml:space="preserve"> </w:t>
+      </w:r>
+      <w:r>
+        <w:rPr>
+          <w:b/>
+          <w:bCs/>
+        </w:rPr>
+        <w:t xml:space="preserve">Account.</w:t>
+      </w:r>
+    </w:p>
+    <w:p>
+      <w:pPr>
+        <w:pStyle w:val="BodyText"/>
+      </w:pPr>
+      <w:r>
+        <w:t xml:space="preserve">Innes “alleges that Adams and Balboa converted the Forsaken Discord Servers.” (Am. Countercl, Dkt. 34 ¶ 160.) He also alleges that plaintiffs converted the “Forsaken Roblox Group, the Group Owner account, and the associated operating accounts.” (</w:t>
       </w:r>
       <w:r>
         <w:rPr>
@@ -1092,7 +1834,7 @@
         <w:t xml:space="preserve"> </w:t>
       </w:r>
       <w:r>
-        <w:t xml:space="preserve">¶ 170.) Finally, Innes alleges that he “owned and had the right to possess and control the Spectre Account and the funds it contained[.]” (</w:t>
+        <w:t xml:space="preserve">¶ 170.) Finally, Innes alleges that he “owned and had the right to possess and control the Spectre Account and the funds it contained[.]” (</w:t>
       </w:r>
       <w:r>
         <w:rPr>
@@ -1105,7 +1847,7 @@
         <w:t xml:space="preserve"> </w:t>
       </w:r>
       <w:r>
-        <w:t xml:space="preserve">¶ 178.)</w:t>
+        <w:t xml:space="preserve">¶ 178.)</w:t>
       </w:r>
     </w:p>
     <w:p>
@@ -1123,7 +1865,7 @@
           <w:i/>
           <w:iCs/>
         </w:rPr>
-        <w:t xml:space="preserve">Staffing Specifix, Inc. v. TempWorks Mgmt. Servs., Inc.</w:t>
+        <w:t xml:space="preserve">Staffing Specifix, Inc. v. TempWorks Mgmt. Servs., Inc.</w:t>
       </w:r>
       <w:r>
         <w:t xml:space="preserve">, 896 N.W.2d 115, 125 (Minn. App. 2017) (cleaned up). “The elements of common law conversion are: (1) plaintiff holds a property interest; and (2) defendant deprives plaintiff of that interest.”</w:t>
@@ -1152,10 +1894,16 @@
           <w:i/>
           <w:iCs/>
         </w:rPr>
-        <w:t xml:space="preserve">See TCI Bus. Cap. Inc. v. Five Star Am. Die Casting, LLC</w:t>
-      </w:r>
-      <w:r>
-        <w:t xml:space="preserve">, 890 N.W.2d 423, 428-30 (Minn. App. 2017).</w:t>
+        <w:t xml:space="preserve">See TCI Bus. Cap. Inc. v. Five Star Am. Die Casting, LLC</w:t>
+      </w:r>
+      <w:r>
+        <w:t xml:space="preserve">, 890 N.W.2d 423, 428</w:t>
+      </w:r>
+      <w:r>
+        <w:noBreakHyphen/>
+      </w:r>
+      <w:r>
+        <w:t xml:space="preserve">30 (Minn. App. 2017).</w:t>
       </w:r>
     </w:p>
     <w:p>
@@ -1169,7 +1917,7 @@
         <w:rPr>
           <w:rStyle w:val="FootnoteReference"/>
         </w:rPr>
-        <w:footnoteReference w:id="19"/>
+        <w:footnoteReference w:id="10"/>
       </w:r>
       <w:r>
         <w:t xml:space="preserve"> </w:t>
@@ -1188,7 +1936,13 @@
         <w:t xml:space="preserve">TCI Bus. Cap. Inc.</w:t>
       </w:r>
       <w:r>
-        <w:t xml:space="preserve">, 890 N.W.2d at 428-30.</w:t>
+        <w:t xml:space="preserve">, 890 N.W.2d at 428</w:t>
+      </w:r>
+      <w:r>
+        <w:noBreakHyphen/>
+      </w:r>
+      <w:r>
+        <w:t xml:space="preserve">30.</w:t>
       </w:r>
     </w:p>
     <w:p>
@@ -1228,7 +1982,7 @@
         <w:t xml:space="preserve"> </w:t>
       </w:r>
       <w:r>
-        <w:t xml:space="preserve">at 429. Here, Innes alleges that he “owned and had the right to possess and control the Spectre Account and the funds it contained,” but he does not allege that the Spectre Account contained specific tangible money that was converted. (Am. Countercl, Dkt. 34 ¶ 178.)</w:t>
+        <w:t xml:space="preserve">at 429. Here, Innes alleges that he “owned and had the right to possess and control the Spectre Account and the funds it contained,” but he does not allege that the Spectre Account contained specific tangible money that was converted. (Am. Countercl, Dkt. 34 ¶ 178.)</w:t>
       </w:r>
     </w:p>
     <w:p>
@@ -1242,19 +1996,69 @@
     <w:p>
       <w:pPr>
         <w:pStyle w:val="Heading3"/>
-      </w:pPr>
-      <w:bookmarkStart w:id="20" w:name="_19e15417809d88949c66dd7c22df52a5f8349a4"/>
-      <w:r>
-        <w:t xml:space="preserve">E. Count XVII: Accounting.</w:t>
-      </w:r>
-      <w:bookmarkEnd w:id="20"/>
-    </w:p>
-    <w:p>
-      <w:pPr>
-        <w:pStyle w:val="FirstParagraph"/>
-      </w:pPr>
-      <w:r>
-        <w:t xml:space="preserve">In Count XVII, Innes alleges that he “is entitled to a full and complete accounting of all revenues, proceeds, and other benefits derived from the Forsaken Property and all accounts associated therewith, from the date Adams and Balboa assumed control to the present.” (Am. Countercl. Dkt. 34 ¶ 212.) He alleges that “[t]he amounts owed to [Innes] cannot be determined without an accounting.” (</w:t>
+        <w:keepNext/>
+        <w:keepLines/>
+        <w:spacing w:before="299" w:after="299" w:line="299" w:lineRule="exact"/>
+        <w:ind w:left="1440" w:hanging="720"/>
+        <w:jc w:val="left"/>
+        <w:outlineLvl w:val="2"/>
+      </w:pPr>
+      <w:r>
+        <w:rPr>
+          <w:b/>
+          <w:bCs/>
+        </w:rPr>
+        <w:t xml:space="preserve">E.</w:t>
+      </w:r>
+      <w:r>
+        <w:rPr>
+          <w:b/>
+          <w:bCs/>
+        </w:rPr>
+        <w:t xml:space="preserve"> </w:t>
+      </w:r>
+      <w:r>
+        <w:rPr>
+          <w:b/>
+          <w:bCs/>
+        </w:rPr>
+        <w:t xml:space="preserve">Count</w:t>
+      </w:r>
+      <w:r>
+        <w:rPr>
+          <w:b/>
+          <w:bCs/>
+        </w:rPr>
+        <w:t xml:space="preserve"> </w:t>
+      </w:r>
+      <w:r>
+        <w:rPr>
+          <w:b/>
+          <w:bCs/>
+        </w:rPr>
+        <w:t xml:space="preserve">XVII:</w:t>
+      </w:r>
+      <w:r>
+        <w:rPr>
+          <w:b/>
+          <w:bCs/>
+        </w:rPr>
+        <w:t xml:space="preserve"> </w:t>
+      </w:r>
+      <w:r>
+        <w:rPr>
+          <w:b/>
+          <w:bCs/>
+        </w:rPr>
+        <w:t xml:space="preserve">Accounting.</w:t>
+      </w:r>
+    </w:p>
+    <w:p>
+      <w:pPr>
+        <w:pStyle w:val="BodyText"/>
+      </w:pPr>
+      <w:r>
+        <w:t xml:space="preserve">In Count XVII, Innes alleges that he “is entitled to a full and complete accounting of all revenues, proceeds, and other benefits derived from the Forsaken Property and all accounts associated therewith, from the date Adams and Balboa assumed control to the present.” (Am. Countercl. Dkt. 34 ¶ 212.) He alleges that “[t]he amounts owed to [Innes] cannot be determined without an accounting.” (</w:t>
       </w:r>
       <w:r>
         <w:rPr>
@@ -1267,7 +2071,7 @@
         <w:t xml:space="preserve"> </w:t>
       </w:r>
       <w:r>
-        <w:t xml:space="preserve">¶ 211.)</w:t>
+        <w:t xml:space="preserve">¶ 211.)</w:t>
       </w:r>
     </w:p>
     <w:p>
@@ -1304,7 +2108,7 @@
         <w:t xml:space="preserve"> </w:t>
       </w:r>
       <w:r>
-        <w:t xml:space="preserve">1A C.J.S. Accounting § 21 (2017) (“The remedy of an equitable accounting is available when a fiduciary owes an equitable duty to account.”). There must also be an “absence of an adequate remedy at law.”</w:t>
+        <w:t xml:space="preserve">1A C.J.S. Accounting § 21 (2017) (“The remedy of an equitable accounting is available when a fiduciary owes an equitable duty to account.”). There must also be an “absence of an adequate remedy at law.”</w:t>
       </w:r>
       <w:r>
         <w:t xml:space="preserve"> </w:t>
@@ -1317,7 +2121,7 @@
         <w:t xml:space="preserve">Landgraf v. Ellsworth</w:t>
       </w:r>
       <w:r>
-        <w:t xml:space="preserve">, 126 N.W.2d 766, 769 (Minn. 1964). “An equity court has jurisdiction to order a fiduciary to account if the fiduciary is obligated to account for his or her use of the plaintiff’s property, or when the fiduciary is accused of breach of trust.” 1A C.J.S. Accounting § 21 (2017).</w:t>
+        <w:t xml:space="preserve">, 126 N.W.2d 766, 769 (Minn. 1964). “An equity court has jurisdiction to order a fiduciary to account if the fiduciary is obligated to account for his or her use of the plaintiff’s property, or when the fiduciary is accused of breach of trust.” 1A C.J.S. Accounting § 21 (2017).</w:t>
       </w:r>
     </w:p>
     <w:p>
@@ -1338,22 +2142,119 @@
         <w:t xml:space="preserve">Gilk v. Fisher</w:t>
       </w:r>
       <w:r>
-        <w:t xml:space="preserve">, No. CV 25-2158 (JRT/LIB), 2026 WL 884100, at *14 (D. Minn. Mar. 31, 2026) (dismissing standalone accounting claim). Furthermore, Innes does not allege that Adams and Balboa were his fiduciaries or owed him an equitable duty to account. He therefore failed to allege entitlement to an accounting remedy under Minnesota law, and Count XVII should be dismissed.</w:t>
-      </w:r>
-    </w:p>
-    <w:p>
-      <w:pPr>
-        <w:pStyle w:val="Heading1"/>
-      </w:pPr>
-      <w:bookmarkStart w:id="21" w:name="_cbd98ca6256903e9a1aecdaa7f8a75c181060f4"/>
-      <w:r>
-        <w:t xml:space="preserve">III. Leave to amend should be denied.</w:t>
-      </w:r>
-      <w:bookmarkEnd w:id="21"/>
-    </w:p>
-    <w:p>
-      <w:pPr>
-        <w:pStyle w:val="FirstParagraph"/>
+        <w:t xml:space="preserve">, No. CV 25</w:t>
+      </w:r>
+      <w:r>
+        <w:noBreakHyphen/>
+      </w:r>
+      <w:r>
+        <w:t xml:space="preserve">2158 (JRT/​LIB), 2026 WL 884100, at *14 (D. Minn. Mar. 31, 2026) (dismissing standalone accounting claim). Furthermore, Innes does not allege that Adams and Balboa were his fiduciaries or owed him an equitable duty to account. He therefore failed to allege entitlement to an accounting remedy under Minnesota law, and Count XVII should be dismissed.</w:t>
+      </w:r>
+    </w:p>
+    <w:p>
+      <w:pPr>
+        <w:keepNext/>
+        <w:keepLines/>
+        <w:spacing w:before="299" w:after="299" w:line="299" w:lineRule="exact"/>
+        <w:ind w:left="0" w:firstLine="0"/>
+        <w:jc w:val="center"/>
+        <w:outlineLvl w:val="0"/>
+      </w:pPr>
+      <w:r>
+        <w:rPr>
+          <w:b/>
+          <w:bCs/>
+        </w:rPr>
+        <w:t xml:space="preserve">III.</w:t>
+      </w:r>
+      <w:r>
+        <w:rPr>
+          <w:b/>
+          <w:bCs/>
+        </w:rPr>
+        <w:t xml:space="preserve"> </w:t>
+      </w:r>
+      <w:r>
+        <w:rPr>
+          <w:b/>
+          <w:bCs/>
+        </w:rPr>
+        <w:t xml:space="preserve">Leave</w:t>
+      </w:r>
+      <w:r>
+        <w:rPr>
+          <w:b/>
+          <w:bCs/>
+        </w:rPr>
+        <w:t xml:space="preserve"> </w:t>
+      </w:r>
+      <w:r>
+        <w:rPr>
+          <w:b/>
+          <w:bCs/>
+        </w:rPr>
+        <w:t xml:space="preserve">to</w:t>
+      </w:r>
+      <w:r>
+        <w:rPr>
+          <w:b/>
+          <w:bCs/>
+        </w:rPr>
+        <w:t xml:space="preserve"> </w:t>
+      </w:r>
+      <w:r>
+        <w:rPr>
+          <w:b/>
+          <w:bCs/>
+        </w:rPr>
+        <w:t xml:space="preserve">amend</w:t>
+      </w:r>
+      <w:r>
+        <w:rPr>
+          <w:b/>
+          <w:bCs/>
+        </w:rPr>
+        <w:t xml:space="preserve"> </w:t>
+      </w:r>
+      <w:r>
+        <w:rPr>
+          <w:b/>
+          <w:bCs/>
+        </w:rPr>
+        <w:t xml:space="preserve">should</w:t>
+      </w:r>
+      <w:r>
+        <w:rPr>
+          <w:b/>
+          <w:bCs/>
+        </w:rPr>
+        <w:t xml:space="preserve"> </w:t>
+      </w:r>
+      <w:r>
+        <w:rPr>
+          <w:b/>
+          <w:bCs/>
+        </w:rPr>
+        <w:t xml:space="preserve">be</w:t>
+      </w:r>
+      <w:r>
+        <w:rPr>
+          <w:b/>
+          <w:bCs/>
+        </w:rPr>
+        <w:t xml:space="preserve"> </w:t>
+      </w:r>
+      <w:r>
+        <w:rPr>
+          <w:b/>
+          <w:bCs/>
+        </w:rPr>
+        <w:t xml:space="preserve">denied.</w:t>
+      </w:r>
+    </w:p>
+    <w:p>
+      <w:pPr>
+        <w:pStyle w:val="BodyText"/>
       </w:pPr>
       <w:r>
         <w:t xml:space="preserve">The Court should deny leave to amend, as any amendment would be futile. The defects in these counterclaims are legal, not factual, and no additional allegation cures them. No additional pleadings can make a statement about ownership of Forsaken defamatory as a matter of law. A Discord server will not become a tangible good subject to bailment, or property subject to conversion under Minnesota law, however Innes recharacterizes it. He cannot plead reliance on a representation he alleges he knew was false more than a month before he signed the Transfer Agreement. And no amendment can make Adams and Balboa his fiduciaries when his own pleading describes them as counterparties to a negotiated sale.</w:t>
@@ -1374,7 +2275,7 @@
           <w:i/>
           <w:iCs/>
         </w:rPr>
-        <w:t xml:space="preserve">Moses.com Secs., Inc. v. Comprehensive Software Sys., Inc.</w:t>
+        <w:t xml:space="preserve">Moses.com Secs., Inc. v. Comprehensive Software Sys., Inc.</w:t>
       </w:r>
       <w:r>
         <w:t xml:space="preserve">, 406 F.3d 1052, 1065 (8th Cir. 2005).</w:t>
@@ -1382,17 +2283,24 @@
     </w:p>
     <w:p>
       <w:pPr>
-        <w:pStyle w:val="Heading1"/>
-      </w:pPr>
-      <w:bookmarkStart w:id="22" w:name="_conclusion"/>
-      <w:r>
+        <w:keepNext/>
+        <w:keepLines/>
+        <w:spacing w:before="299" w:after="299" w:line="299" w:lineRule="exact"/>
+        <w:ind w:left="0" w:firstLine="0"/>
+        <w:jc w:val="center"/>
+        <w:outlineLvl w:val="0"/>
+      </w:pPr>
+      <w:r>
+        <w:rPr>
+          <w:b/>
+          <w:bCs/>
+        </w:rPr>
         <w:t xml:space="preserve">CONCLUSION</w:t>
       </w:r>
-      <w:bookmarkEnd w:id="22"/>
-    </w:p>
-    <w:p>
-      <w:pPr>
-        <w:pStyle w:val="FirstParagraph"/>
+    </w:p>
+    <w:p>
+      <w:pPr>
+        <w:pStyle w:val="BodyText"/>
       </w:pPr>
       <w:r>
         <w:t xml:space="preserve">Innes’ counterclaims are a grab-bag of ill-fitting claims. He has manufactured 21 claims arising out of what is, at base, a single agreement. Innes’ fraud, defamation, breach of bailment, conversion, and accounting claims should be dismissed without leave to amend.</w:t>
@@ -1400,32 +2308,28 @@
     </w:p>
     <w:p>
       <w:pPr>
-        <w:spacing w:before="0" w:after="0" w:line="598" w:lineRule="exact"/>
+        <w:keepNext/>
+        <w:keepLines/>
+        <w:spacing w:before="578" w:after="0" w:line="20" w:lineRule="exact"/>
+        <w:ind w:left="0" w:firstLine="0"/>
+        <w:jc w:val="left"/>
       </w:pPr>
     </w:p>
     <w:tbl>
       <w:tblPr>
         <w:tblW w:w="9360" w:type="dxa"/>
-        <w:tblInd w:w="0" w:type="dxa"/>
-        <w:tblBorders>
-          <w:top w:val="nil"/>
-          <w:left w:val="nil"/>
-          <w:bottom w:val="nil"/>
-          <w:right w:val="nil"/>
-          <w:insideH w:val="nil"/>
-          <w:insideV w:val="nil"/>
-        </w:tblBorders>
         <w:tblLayout w:type="fixed"/>
         <w:tblCellMar>
+          <w:top w:w="0" w:type="dxa"/>
           <w:left w:w="0" w:type="dxa"/>
+          <w:bottom w:w="0" w:type="dxa"/>
           <w:right w:w="0" w:type="dxa"/>
         </w:tblCellMar>
-        <w:tblLook w:val="0000"/>
+        <w:tblLook w:val="0000" w:firstRow="0" w:lastRow="0" w:firstColumn="0" w:lastColumn="0" w:noHBand="0" w:noVBand="0"/>
       </w:tblPr>
       <w:tblGrid>
         <w:gridCol w:w="3744"/>
-        <w:gridCol w:w="288"/>
-        <w:gridCol w:w="5328"/>
+        <w:gridCol w:w="5616"/>
       </w:tblGrid>
       <w:tr>
         <w:trPr>
@@ -1437,329 +2341,569 @@
           </w:tcPr>
           <w:p>
             <w:pPr>
-              <w:keepNext/>
               <w:spacing w:before="0" w:after="0" w:line="299" w:lineRule="exact"/>
+              <w:ind w:left="0" w:firstLine="0"/>
+              <w:jc w:val="left"/>
             </w:pPr>
             <w:r>
-              <w:rPr>
-                <w:sz w:val="26"/>
-                <w:szCs w:val="26"/>
-              </w:rPr>
-              <w:t xml:space="preserve">Dated: September 22, 2026</w:t>
+              <w:t xml:space="preserve">Dated: </w:t>
+            </w:r>
+            <w:r>
+              <w:t xml:space="preserve">September</w:t>
+            </w:r>
+            <w:r>
+              <w:t xml:space="preserve"> </w:t>
+            </w:r>
+            <w:r>
+              <w:t xml:space="preserve">22,</w:t>
+            </w:r>
+            <w:r>
+              <w:t xml:space="preserve"> </w:t>
+            </w:r>
+            <w:r>
+              <w:t xml:space="preserve">2026</w:t>
             </w:r>
           </w:p>
         </w:tc>
         <w:tc>
           <w:tcPr>
-            <w:tcW w:w="288" w:type="dxa"/>
+            <w:tcW w:w="5616" w:type="dxa"/>
+            <w:tcMar>
+              <w:left w:w="288" w:type="dxa"/>
+            </w:tcMar>
           </w:tcPr>
           <w:p>
             <w:pPr>
               <w:spacing w:before="0" w:after="0" w:line="299" w:lineRule="exact"/>
+              <w:ind w:left="0" w:firstLine="0"/>
+              <w:jc w:val="left"/>
             </w:pPr>
-          </w:p>
-        </w:tc>
-        <w:tc>
-          <w:tcPr>
-            <w:tcW w:w="5328" w:type="dxa"/>
-          </w:tcPr>
-          <w:p>
-            <w:pPr>
-              <w:keepNext/>
-              <w:spacing w:before="0" w:after="130" w:line="299" w:lineRule="exact"/>
-            </w:pPr>
-            <w:r>
-              <w:rPr>
-                <w:sz w:val="26"/>
-                <w:szCs w:val="26"/>
-              </w:rPr>
-              <w:t xml:space="preserve">TAFT STETTINIUS &amp; HOLLISTER LLP</w:t>
+            <w:r>
+              <w:t xml:space="preserve">TAFT</w:t>
+            </w:r>
+            <w:r>
+              <w:t xml:space="preserve"> </w:t>
+            </w:r>
+            <w:r>
+              <w:t xml:space="preserve">STETTINIUS</w:t>
+            </w:r>
+            <w:r>
+              <w:t xml:space="preserve"> </w:t>
+            </w:r>
+            <w:r>
+              <w:t xml:space="preserve">&amp;</w:t>
+            </w:r>
+            <w:r>
+              <w:t xml:space="preserve"> </w:t>
+            </w:r>
+            <w:r>
+              <w:t xml:space="preserve">HOLLISTER</w:t>
+            </w:r>
+            <w:r>
+              <w:t xml:space="preserve"> </w:t>
+            </w:r>
+            <w:r>
+              <w:t xml:space="preserve">LLP</w:t>
             </w:r>
           </w:p>
           <w:p>
             <w:pPr>
-              <w:keepNext/>
-              <w:spacing w:before="0" w:after="130" w:line="299" w:lineRule="exact"/>
+              <w:spacing w:before="0" w:after="0" w:line="299" w:lineRule="exact"/>
+              <w:ind w:left="0" w:firstLine="0"/>
+              <w:jc w:val="left"/>
             </w:pPr>
             <w:r>
-              <w:rPr>
-                <w:sz w:val="26"/>
-                <w:szCs w:val="26"/>
-              </w:rPr>
               <w:t xml:space="preserve"> </w:t>
             </w:r>
           </w:p>
           <w:p>
             <w:pPr>
-              <w:keepNext/>
-              <w:spacing w:before="0" w:after="130" w:line="299" w:lineRule="exact"/>
+              <w:spacing w:before="0" w:after="0" w:line="299" w:lineRule="exact"/>
+              <w:ind w:left="0" w:firstLine="0"/>
+              <w:jc w:val="left"/>
             </w:pPr>
             <w:r>
-              <w:rPr>
-                <w:sz w:val="26"/>
-                <w:szCs w:val="26"/>
-              </w:rPr>
-              <w:t xml:space="preserve">By: s/ Andrew S. Dosdall</w:t>
+              <w:t xml:space="preserve">By:</w:t>
+            </w:r>
+            <w:r>
+              <w:t xml:space="preserve"> </w:t>
+            </w:r>
+            <w:r>
+              <w:t xml:space="preserve">s/</w:t>
+            </w:r>
+            <w:r>
+              <w:t xml:space="preserve"> </w:t>
+            </w:r>
+            <w:r>
+              <w:t xml:space="preserve">Andrew</w:t>
+            </w:r>
+            <w:r>
+              <w:t xml:space="preserve"> </w:t>
+            </w:r>
+            <w:r>
+              <w:t xml:space="preserve">S.</w:t>
+            </w:r>
+            <w:r>
+              <w:t xml:space="preserve"> </w:t>
+            </w:r>
+            <w:r>
+              <w:t xml:space="preserve">Dosdall</w:t>
             </w:r>
           </w:p>
           <w:p>
             <w:pPr>
-              <w:keepNext/>
-              <w:spacing w:before="0" w:after="130" w:line="299" w:lineRule="exact"/>
+              <w:spacing w:before="0" w:after="0" w:line="299" w:lineRule="exact"/>
+              <w:ind w:left="0" w:firstLine="0"/>
+              <w:jc w:val="left"/>
             </w:pPr>
             <w:r>
-              <w:rPr>
-                <w:sz w:val="26"/>
-                <w:szCs w:val="26"/>
-              </w:rPr>
-              <w:t xml:space="preserve">Andrew S. Dosdall, Bar No. 0391076</w:t>
+              <w:t xml:space="preserve">Andrew</w:t>
+            </w:r>
+            <w:r>
+              <w:t xml:space="preserve"> </w:t>
+            </w:r>
+            <w:r>
+              <w:t xml:space="preserve">S.</w:t>
+            </w:r>
+            <w:r>
+              <w:t xml:space="preserve"> </w:t>
+            </w:r>
+            <w:r>
+              <w:t xml:space="preserve">Dosdall,</w:t>
+            </w:r>
+            <w:r>
+              <w:t xml:space="preserve"> </w:t>
+            </w:r>
+            <w:r>
+              <w:t xml:space="preserve">Bar</w:t>
+            </w:r>
+            <w:r>
+              <w:t xml:space="preserve"> </w:t>
+            </w:r>
+            <w:r>
+              <w:t xml:space="preserve">No.</w:t>
+            </w:r>
+            <w:r>
+              <w:t xml:space="preserve"> </w:t>
+            </w:r>
+            <w:r>
+              <w:t xml:space="preserve">0391076</w:t>
             </w:r>
           </w:p>
           <w:p>
             <w:pPr>
-              <w:keepNext/>
-              <w:spacing w:before="0" w:after="130" w:line="299" w:lineRule="exact"/>
+              <w:spacing w:before="0" w:after="0" w:line="299" w:lineRule="exact"/>
+              <w:ind w:left="0" w:firstLine="0"/>
+              <w:jc w:val="left"/>
             </w:pPr>
             <w:r>
-              <w:rPr>
-                <w:sz w:val="26"/>
-                <w:szCs w:val="26"/>
-              </w:rPr>
               <w:t xml:space="preserve">ADosdall@Taftlaw.com</w:t>
             </w:r>
           </w:p>
           <w:p>
             <w:pPr>
-              <w:keepNext/>
-              <w:spacing w:before="0" w:after="130" w:line="299" w:lineRule="exact"/>
+              <w:spacing w:before="0" w:after="0" w:line="299" w:lineRule="exact"/>
+              <w:ind w:left="0" w:firstLine="0"/>
+              <w:jc w:val="left"/>
             </w:pPr>
             <w:r>
-              <w:rPr>
-                <w:sz w:val="26"/>
-                <w:szCs w:val="26"/>
-              </w:rPr>
-              <w:t xml:space="preserve">2200 IDS Center</w:t>
+              <w:t xml:space="preserve">2200</w:t>
+            </w:r>
+            <w:r>
+              <w:t xml:space="preserve"> </w:t>
+            </w:r>
+            <w:r>
+              <w:t xml:space="preserve">IDS</w:t>
+            </w:r>
+            <w:r>
+              <w:t xml:space="preserve"> </w:t>
+            </w:r>
+            <w:r>
+              <w:t xml:space="preserve">Center</w:t>
             </w:r>
           </w:p>
           <w:p>
             <w:pPr>
-              <w:keepNext/>
-              <w:spacing w:before="0" w:after="130" w:line="299" w:lineRule="exact"/>
+              <w:spacing w:before="0" w:after="0" w:line="299" w:lineRule="exact"/>
+              <w:ind w:left="0" w:firstLine="0"/>
+              <w:jc w:val="left"/>
             </w:pPr>
             <w:r>
-              <w:rPr>
-                <w:sz w:val="26"/>
-                <w:szCs w:val="26"/>
-              </w:rPr>
-              <w:t xml:space="preserve">80 South 8th Street</w:t>
+              <w:t xml:space="preserve">80</w:t>
+            </w:r>
+            <w:r>
+              <w:t xml:space="preserve"> </w:t>
+            </w:r>
+            <w:r>
+              <w:t xml:space="preserve">South</w:t>
+            </w:r>
+            <w:r>
+              <w:t xml:space="preserve"> </w:t>
+            </w:r>
+            <w:r>
+              <w:t xml:space="preserve">8th</w:t>
+            </w:r>
+            <w:r>
+              <w:t xml:space="preserve"> </w:t>
+            </w:r>
+            <w:r>
+              <w:t xml:space="preserve">Street</w:t>
             </w:r>
           </w:p>
           <w:p>
             <w:pPr>
-              <w:keepNext/>
-              <w:spacing w:before="0" w:after="130" w:line="299" w:lineRule="exact"/>
+              <w:spacing w:before="0" w:after="0" w:line="299" w:lineRule="exact"/>
+              <w:ind w:left="0" w:firstLine="0"/>
+              <w:jc w:val="left"/>
             </w:pPr>
             <w:r>
-              <w:rPr>
-                <w:sz w:val="26"/>
-                <w:szCs w:val="26"/>
-              </w:rPr>
-              <w:t xml:space="preserve">Minneapolis, MN 55402-2210</w:t>
+              <w:t xml:space="preserve">Minneapolis,</w:t>
+            </w:r>
+            <w:r>
+              <w:t xml:space="preserve"> </w:t>
+            </w:r>
+            <w:r>
+              <w:t xml:space="preserve">MN</w:t>
+            </w:r>
+            <w:r>
+              <w:t xml:space="preserve"> </w:t>
+            </w:r>
+            <w:r>
+              <w:t xml:space="preserve">55402</w:t>
+              <w:noBreakHyphen/>
+              <w:t xml:space="preserve">2210</w:t>
             </w:r>
           </w:p>
           <w:p>
             <w:pPr>
-              <w:keepNext/>
-              <w:spacing w:before="0" w:after="130" w:line="299" w:lineRule="exact"/>
+              <w:spacing w:before="0" w:after="0" w:line="299" w:lineRule="exact"/>
+              <w:ind w:left="0" w:firstLine="0"/>
+              <w:jc w:val="left"/>
             </w:pPr>
             <w:r>
-              <w:rPr>
-                <w:sz w:val="26"/>
-                <w:szCs w:val="26"/>
-              </w:rPr>
-              <w:t xml:space="preserve">Telephone: (612) 977-8400</w:t>
+              <w:t xml:space="preserve">Telephone:</w:t>
+            </w:r>
+            <w:r>
+              <w:t xml:space="preserve"> </w:t>
+            </w:r>
+            <w:r>
+              <w:t xml:space="preserve">(612)</w:t>
+            </w:r>
+            <w:r>
+              <w:t xml:space="preserve"> </w:t>
+            </w:r>
+            <w:r>
+              <w:t xml:space="preserve">977</w:t>
+              <w:noBreakHyphen/>
+              <w:t xml:space="preserve">8400</w:t>
             </w:r>
           </w:p>
           <w:p>
             <w:pPr>
-              <w:keepNext/>
-              <w:spacing w:before="0" w:after="130" w:line="299" w:lineRule="exact"/>
+              <w:spacing w:before="0" w:after="0" w:line="299" w:lineRule="exact"/>
+              <w:ind w:left="0" w:firstLine="0"/>
+              <w:jc w:val="left"/>
             </w:pPr>
             <w:r>
-              <w:rPr>
-                <w:sz w:val="26"/>
-                <w:szCs w:val="26"/>
-              </w:rPr>
-              <w:t xml:space="preserve">Facsimile: (612) 977-8650</w:t>
+              <w:t xml:space="preserve">Facsimile:</w:t>
+            </w:r>
+            <w:r>
+              <w:t xml:space="preserve"> </w:t>
+            </w:r>
+            <w:r>
+              <w:t xml:space="preserve">(612)</w:t>
+            </w:r>
+            <w:r>
+              <w:t xml:space="preserve"> </w:t>
+            </w:r>
+            <w:r>
+              <w:t xml:space="preserve">977</w:t>
+              <w:noBreakHyphen/>
+              <w:t xml:space="preserve">8650</w:t>
             </w:r>
           </w:p>
           <w:p>
             <w:pPr>
-              <w:keepNext/>
-              <w:spacing w:before="0" w:after="130" w:line="299" w:lineRule="exact"/>
+              <w:spacing w:before="0" w:after="0" w:line="299" w:lineRule="exact"/>
+              <w:ind w:left="0" w:firstLine="0"/>
+              <w:jc w:val="left"/>
             </w:pPr>
             <w:r>
-              <w:rPr>
-                <w:sz w:val="26"/>
-                <w:szCs w:val="26"/>
-              </w:rPr>
               <w:t xml:space="preserve"> </w:t>
             </w:r>
           </w:p>
           <w:p>
             <w:pPr>
-              <w:keepNext/>
-              <w:spacing w:before="0" w:after="130" w:line="299" w:lineRule="exact"/>
+              <w:spacing w:before="0" w:after="0" w:line="299" w:lineRule="exact"/>
+              <w:ind w:left="0" w:firstLine="0"/>
+              <w:jc w:val="left"/>
             </w:pPr>
             <w:r>
-              <w:rPr>
-                <w:sz w:val="26"/>
-                <w:szCs w:val="26"/>
-              </w:rPr>
               <w:t xml:space="preserve">and</w:t>
             </w:r>
           </w:p>
           <w:p>
             <w:pPr>
-              <w:keepNext/>
-              <w:spacing w:before="0" w:after="130" w:line="299" w:lineRule="exact"/>
+              <w:spacing w:before="0" w:after="0" w:line="299" w:lineRule="exact"/>
+              <w:ind w:left="0" w:firstLine="0"/>
+              <w:jc w:val="left"/>
             </w:pPr>
             <w:r>
-              <w:rPr>
-                <w:sz w:val="26"/>
-                <w:szCs w:val="26"/>
-              </w:rPr>
               <w:t xml:space="preserve"> </w:t>
             </w:r>
           </w:p>
           <w:p>
             <w:pPr>
-              <w:keepNext/>
-              <w:spacing w:before="0" w:after="130" w:line="299" w:lineRule="exact"/>
+              <w:spacing w:before="0" w:after="0" w:line="299" w:lineRule="exact"/>
+              <w:ind w:left="0" w:firstLine="0"/>
+              <w:jc w:val="left"/>
             </w:pPr>
             <w:r>
-              <w:rPr>
-                <w:sz w:val="26"/>
-                <w:szCs w:val="26"/>
-              </w:rPr>
-              <w:t xml:space="preserve">Joseph M. Levy, OSB #231905 (Pro Hac Vice)</w:t>
+              <w:t xml:space="preserve">Joseph</w:t>
+            </w:r>
+            <w:r>
+              <w:t xml:space="preserve"> </w:t>
+            </w:r>
+            <w:r>
+              <w:t xml:space="preserve">M.</w:t>
+            </w:r>
+            <w:r>
+              <w:t xml:space="preserve"> </w:t>
+            </w:r>
+            <w:r>
+              <w:t xml:space="preserve">Levy,</w:t>
+            </w:r>
+            <w:r>
+              <w:t xml:space="preserve"> </w:t>
+            </w:r>
+            <w:r>
+              <w:t xml:space="preserve">OSB</w:t>
+            </w:r>
+            <w:r>
+              <w:t xml:space="preserve"> </w:t>
+            </w:r>
+            <w:r>
+              <w:t xml:space="preserve">#231905</w:t>
+            </w:r>
+            <w:r>
+              <w:t xml:space="preserve"> </w:t>
+            </w:r>
+            <w:r>
+              <w:t xml:space="preserve">(Pro</w:t>
+            </w:r>
+            <w:r>
+              <w:t xml:space="preserve"> </w:t>
+            </w:r>
+            <w:r>
+              <w:t xml:space="preserve">Hac</w:t>
+            </w:r>
+            <w:r>
+              <w:t xml:space="preserve"> </w:t>
+            </w:r>
+            <w:r>
+              <w:t xml:space="preserve">Vice)</w:t>
             </w:r>
           </w:p>
           <w:p>
             <w:pPr>
-              <w:keepNext/>
-              <w:spacing w:before="0" w:after="130" w:line="299" w:lineRule="exact"/>
+              <w:spacing w:before="0" w:after="0" w:line="299" w:lineRule="exact"/>
+              <w:ind w:left="0" w:firstLine="0"/>
+              <w:jc w:val="left"/>
             </w:pPr>
             <w:r>
-              <w:rPr>
-                <w:sz w:val="26"/>
-                <w:szCs w:val="26"/>
-              </w:rPr>
               <w:t xml:space="preserve">JosephLevy@MarkowitzHerbold.com</w:t>
             </w:r>
           </w:p>
           <w:p>
             <w:pPr>
-              <w:keepNext/>
-              <w:spacing w:before="0" w:after="130" w:line="299" w:lineRule="exact"/>
+              <w:spacing w:before="0" w:after="0" w:line="299" w:lineRule="exact"/>
+              <w:ind w:left="0" w:firstLine="0"/>
+              <w:jc w:val="left"/>
             </w:pPr>
             <w:r>
-              <w:rPr>
-                <w:sz w:val="26"/>
-                <w:szCs w:val="26"/>
-              </w:rPr>
-              <w:t xml:space="preserve">MARKOWITZ HERBOLD PC</w:t>
+              <w:t xml:space="preserve">MARKOWITZ</w:t>
+            </w:r>
+            <w:r>
+              <w:t xml:space="preserve"> </w:t>
+            </w:r>
+            <w:r>
+              <w:t xml:space="preserve">HERBOLD</w:t>
+            </w:r>
+            <w:r>
+              <w:t xml:space="preserve"> </w:t>
+            </w:r>
+            <w:r>
+              <w:t xml:space="preserve">PC</w:t>
             </w:r>
           </w:p>
           <w:p>
             <w:pPr>
-              <w:keepNext/>
-              <w:spacing w:before="0" w:after="130" w:line="299" w:lineRule="exact"/>
+              <w:spacing w:before="0" w:after="0" w:line="299" w:lineRule="exact"/>
+              <w:ind w:left="0" w:firstLine="0"/>
+              <w:jc w:val="left"/>
             </w:pPr>
             <w:r>
-              <w:rPr>
-                <w:sz w:val="26"/>
-                <w:szCs w:val="26"/>
-              </w:rPr>
-              <w:t xml:space="preserve">1455 SW Broadway, Suite 1900</w:t>
+              <w:t xml:space="preserve">1455</w:t>
+            </w:r>
+            <w:r>
+              <w:t xml:space="preserve"> </w:t>
+            </w:r>
+            <w:r>
+              <w:t xml:space="preserve">SW</w:t>
+            </w:r>
+            <w:r>
+              <w:t xml:space="preserve"> </w:t>
+            </w:r>
+            <w:r>
+              <w:t xml:space="preserve">Broadway,</w:t>
+            </w:r>
+            <w:r>
+              <w:t xml:space="preserve"> </w:t>
+            </w:r>
+            <w:r>
+              <w:t xml:space="preserve">Suite</w:t>
+            </w:r>
+            <w:r>
+              <w:t xml:space="preserve"> </w:t>
+            </w:r>
+            <w:r>
+              <w:t xml:space="preserve">1900</w:t>
             </w:r>
           </w:p>
           <w:p>
             <w:pPr>
-              <w:keepNext/>
-              <w:spacing w:before="0" w:after="130" w:line="299" w:lineRule="exact"/>
+              <w:spacing w:before="0" w:after="0" w:line="299" w:lineRule="exact"/>
+              <w:ind w:left="0" w:firstLine="0"/>
+              <w:jc w:val="left"/>
             </w:pPr>
             <w:r>
-              <w:rPr>
-                <w:sz w:val="26"/>
-                <w:szCs w:val="26"/>
-              </w:rPr>
-              <w:t xml:space="preserve">Portland, OR 97201</w:t>
+              <w:t xml:space="preserve">Portland,</w:t>
+            </w:r>
+            <w:r>
+              <w:t xml:space="preserve"> </w:t>
+            </w:r>
+            <w:r>
+              <w:t xml:space="preserve">OR</w:t>
+            </w:r>
+            <w:r>
+              <w:t xml:space="preserve"> </w:t>
+            </w:r>
+            <w:r>
+              <w:t xml:space="preserve">97201</w:t>
             </w:r>
           </w:p>
           <w:p>
             <w:pPr>
-              <w:keepNext/>
-              <w:spacing w:before="0" w:after="130" w:line="299" w:lineRule="exact"/>
+              <w:spacing w:before="0" w:after="0" w:line="299" w:lineRule="exact"/>
+              <w:ind w:left="0" w:firstLine="0"/>
+              <w:jc w:val="left"/>
             </w:pPr>
             <w:r>
-              <w:rPr>
-                <w:sz w:val="26"/>
-                <w:szCs w:val="26"/>
-              </w:rPr>
-              <w:t xml:space="preserve">Telephone: (503) 295-3085</w:t>
+              <w:t xml:space="preserve">Telephone:</w:t>
+            </w:r>
+            <w:r>
+              <w:t xml:space="preserve"> </w:t>
+            </w:r>
+            <w:r>
+              <w:t xml:space="preserve">(503)</w:t>
+            </w:r>
+            <w:r>
+              <w:t xml:space="preserve"> </w:t>
+            </w:r>
+            <w:r>
+              <w:t xml:space="preserve">295</w:t>
+              <w:noBreakHyphen/>
+              <w:t xml:space="preserve">3085</w:t>
             </w:r>
           </w:p>
           <w:p>
             <w:pPr>
-              <w:keepNext/>
-              <w:spacing w:before="0" w:after="130" w:line="299" w:lineRule="exact"/>
+              <w:spacing w:before="0" w:after="0" w:line="299" w:lineRule="exact"/>
+              <w:ind w:left="0" w:firstLine="0"/>
+              <w:jc w:val="left"/>
             </w:pPr>
             <w:r>
-              <w:rPr>
-                <w:sz w:val="26"/>
-                <w:szCs w:val="26"/>
-              </w:rPr>
-              <w:t xml:space="preserve">Facsimile: (503) 323-9105</w:t>
+              <w:t xml:space="preserve">Facsimile:</w:t>
+            </w:r>
+            <w:r>
+              <w:t xml:space="preserve"> </w:t>
+            </w:r>
+            <w:r>
+              <w:t xml:space="preserve">(503)</w:t>
+            </w:r>
+            <w:r>
+              <w:t xml:space="preserve"> </w:t>
+            </w:r>
+            <w:r>
+              <w:t xml:space="preserve">323</w:t>
+              <w:noBreakHyphen/>
+              <w:t xml:space="preserve">9105</w:t>
             </w:r>
           </w:p>
           <w:p>
             <w:pPr>
-              <w:keepNext/>
-              <w:spacing w:before="0" w:after="130" w:line="299" w:lineRule="exact"/>
+              <w:spacing w:before="0" w:after="0" w:line="299" w:lineRule="exact"/>
+              <w:ind w:left="0" w:firstLine="0"/>
+              <w:jc w:val="left"/>
             </w:pPr>
             <w:r>
-              <w:rPr>
-                <w:sz w:val="26"/>
-                <w:szCs w:val="26"/>
-              </w:rPr>
               <w:t xml:space="preserve"> </w:t>
             </w:r>
           </w:p>
           <w:p>
             <w:pPr>
-              <w:keepNext/>
-              <w:spacing w:before="0" w:after="130" w:line="299" w:lineRule="exact"/>
+              <w:spacing w:before="0" w:after="0" w:line="299" w:lineRule="exact"/>
+              <w:ind w:left="0" w:firstLine="0"/>
+              <w:jc w:val="left"/>
             </w:pPr>
             <w:r>
-              <w:rPr>
-                <w:sz w:val="26"/>
-                <w:szCs w:val="26"/>
-              </w:rPr>
-              <w:t xml:space="preserve">Attorneys for Plaintiffs</w:t>
+              <w:t xml:space="preserve">Attorneys</w:t>
+            </w:r>
+            <w:r>
+              <w:t xml:space="preserve"> </w:t>
+            </w:r>
+            <w:r>
+              <w:t xml:space="preserve">for</w:t>
+            </w:r>
+            <w:r>
+              <w:t xml:space="preserve"> </w:t>
+            </w:r>
+            <w:r>
+              <w:t xml:space="preserve">Plaintiffs</w:t>
             </w:r>
           </w:p>
           <w:p>
             <w:pPr>
-              <w:keepNext/>
               <w:spacing w:before="0" w:after="0" w:line="299" w:lineRule="exact"/>
+              <w:ind w:left="0" w:firstLine="0"/>
+              <w:jc w:val="left"/>
             </w:pPr>
             <w:r>
-              <w:rPr>
-                <w:sz w:val="26"/>
-                <w:szCs w:val="26"/>
-              </w:rPr>
-              <w:t xml:space="preserve">Eli Adams and Reyna Balboa</w:t>
+              <w:t xml:space="preserve">Eli</w:t>
+            </w:r>
+            <w:r>
+              <w:t xml:space="preserve"> </w:t>
+            </w:r>
+            <w:r>
+              <w:t xml:space="preserve">Adams</w:t>
+            </w:r>
+            <w:r>
+              <w:t xml:space="preserve"> </w:t>
+            </w:r>
+            <w:r>
+              <w:t xml:space="preserve">and</w:t>
+            </w:r>
+            <w:r>
+              <w:t xml:space="preserve"> </w:t>
+            </w:r>
+            <w:r>
+              <w:t xml:space="preserve">Reyna</w:t>
+            </w:r>
+            <w:r>
+              <w:t xml:space="preserve"> </w:t>
+            </w:r>
+            <w:r>
+              <w:t xml:space="preserve">Balboa</w:t>
             </w:r>
           </w:p>
         </w:tc>
@@ -1768,66 +2912,52 @@
     <w:p>
       <w:pPr>
         <w:pageBreakBefore/>
+        <w:spacing w:before="0" w:after="299" w:line="299" w:lineRule="exact"/>
+        <w:ind w:left="0" w:firstLine="0"/>
+        <w:jc w:val="center"/>
+      </w:pPr>
+      <w:r>
+        <w:rPr>
+          <w:b/>
+          <w:bCs/>
+        </w:rPr>
+        <w:t xml:space="preserve">CERTIFICATE OF COMPLIANCE</w:t>
+      </w:r>
+    </w:p>
+    <w:p>
+      <w:pPr>
         <w:spacing w:before="0" w:after="0" w:line="598" w:lineRule="exact"/>
-        <w:jc w:val="center"/>
-      </w:pPr>
-      <w:r>
-        <w:rPr>
-          <w:b/>
-          <w:bCs/>
-          <w:sz w:val="26"/>
-          <w:szCs w:val="26"/>
-        </w:rPr>
-        <w:t xml:space="preserve">CERTIFICATE OF COMPLIANCE</w:t>
-      </w:r>
-    </w:p>
-    <w:p>
-      <w:pPr>
-        <w:spacing w:before="0" w:after="0" w:line="598" w:lineRule="exact"/>
-      </w:pPr>
-    </w:p>
-    <w:p>
-      <w:pPr>
-        <w:spacing w:before="0" w:after="0" w:line="598" w:lineRule="exact"/>
-        <w:ind w:firstLine="720"/>
-        <w:jc w:val="both"/>
-      </w:pPr>
-      <w:r>
-        <w:rPr>
-          <w:sz w:val="26"/>
-          <w:szCs w:val="26"/>
-        </w:rPr>
+        <w:ind w:left="0" w:firstLine="720"/>
+        <w:jc w:val="left"/>
+      </w:pPr>
+      <w:r>
         <w:t xml:space="preserve">I hereby certify that this memorandum complies with the word limit of D. Minn. LR 7.1(f)(1)(A) and the type-size requirement of D. Minn. LR 7.1(h)(1). The memorandum contains 3155 words, counted with Microsoft Word for Microsoft 365, version 2609, which was applied to include all text, including headings, footnotes, and quotations. The count excludes the caption, the signature block, and this certificate (LR 7.1(f)(1)(C)).</w:t>
       </w:r>
     </w:p>
     <w:p>
       <w:pPr>
-        <w:spacing w:before="0" w:after="0" w:line="598" w:lineRule="exact"/>
+        <w:keepNext/>
+        <w:keepLines/>
+        <w:spacing w:before="578" w:after="0" w:line="20" w:lineRule="exact"/>
+        <w:ind w:left="0" w:firstLine="0"/>
+        <w:jc w:val="left"/>
       </w:pPr>
     </w:p>
     <w:tbl>
       <w:tblPr>
         <w:tblW w:w="9360" w:type="dxa"/>
-        <w:tblInd w:w="0" w:type="dxa"/>
-        <w:tblBorders>
-          <w:top w:val="nil"/>
-          <w:left w:val="nil"/>
-          <w:bottom w:val="nil"/>
-          <w:right w:val="nil"/>
-          <w:insideH w:val="nil"/>
-          <w:insideV w:val="nil"/>
-        </w:tblBorders>
         <w:tblLayout w:type="fixed"/>
         <w:tblCellMar>
+          <w:top w:w="0" w:type="dxa"/>
           <w:left w:w="0" w:type="dxa"/>
+          <w:bottom w:w="0" w:type="dxa"/>
           <w:right w:w="0" w:type="dxa"/>
         </w:tblCellMar>
-        <w:tblLook w:val="0000"/>
+        <w:tblLook w:val="0000" w:firstRow="0" w:lastRow="0" w:firstColumn="0" w:lastColumn="0" w:noHBand="0" w:noVBand="0"/>
       </w:tblPr>
       <w:tblGrid>
         <w:gridCol w:w="3744"/>
-        <w:gridCol w:w="288"/>
-        <w:gridCol w:w="5328"/>
+        <w:gridCol w:w="5616"/>
       </w:tblGrid>
       <w:tr>
         <w:trPr>
@@ -1839,43 +2969,63 @@
           </w:tcPr>
           <w:p>
             <w:pPr>
-              <w:keepNext/>
               <w:spacing w:before="0" w:after="0" w:line="299" w:lineRule="exact"/>
+              <w:ind w:left="0" w:firstLine="0"/>
+              <w:jc w:val="left"/>
             </w:pPr>
             <w:r>
-              <w:rPr>
-                <w:sz w:val="26"/>
-                <w:szCs w:val="26"/>
-              </w:rPr>
-              <w:t xml:space="preserve">Dated: September 22, 2026</w:t>
+              <w:t xml:space="preserve">Dated: </w:t>
+            </w:r>
+            <w:r>
+              <w:t xml:space="preserve">September</w:t>
+            </w:r>
+            <w:r>
+              <w:t xml:space="preserve"> </w:t>
+            </w:r>
+            <w:r>
+              <w:t xml:space="preserve">22,</w:t>
+            </w:r>
+            <w:r>
+              <w:t xml:space="preserve"> </w:t>
+            </w:r>
+            <w:r>
+              <w:t xml:space="preserve">2026</w:t>
             </w:r>
           </w:p>
         </w:tc>
         <w:tc>
           <w:tcPr>
-            <w:tcW w:w="288" w:type="dxa"/>
+            <w:tcW w:w="5616" w:type="dxa"/>
+            <w:tcMar>
+              <w:left w:w="288" w:type="dxa"/>
+            </w:tcMar>
           </w:tcPr>
           <w:p>
             <w:pPr>
               <w:spacing w:before="0" w:after="0" w:line="299" w:lineRule="exact"/>
+              <w:ind w:left="0" w:firstLine="0"/>
+              <w:jc w:val="left"/>
             </w:pPr>
-          </w:p>
-        </w:tc>
-        <w:tc>
-          <w:tcPr>
-            <w:tcW w:w="5328" w:type="dxa"/>
-          </w:tcPr>
-          <w:p>
-            <w:pPr>
-              <w:keepNext/>
-              <w:spacing w:before="0" w:after="0" w:line="299" w:lineRule="exact"/>
-            </w:pPr>
-            <w:r>
-              <w:rPr>
-                <w:sz w:val="26"/>
-                <w:szCs w:val="26"/>
-              </w:rPr>
-              <w:t xml:space="preserve">s/ Andrew S. Dosdall</w:t>
+            <w:r>
+              <w:t xml:space="preserve">s/</w:t>
+            </w:r>
+            <w:r>
+              <w:t xml:space="preserve"> </w:t>
+            </w:r>
+            <w:r>
+              <w:t xml:space="preserve">Andrew</w:t>
+            </w:r>
+            <w:r>
+              <w:t xml:space="preserve"> </w:t>
+            </w:r>
+            <w:r>
+              <w:t xml:space="preserve">S.</w:t>
+            </w:r>
+            <w:r>
+              <w:t xml:space="preserve"> </w:t>
+            </w:r>
+            <w:r>
+              <w:t xml:space="preserve">Dosdall</w:t>
             </w:r>
           </w:p>
         </w:tc>
@@ -1883,11 +3033,8 @@
     </w:tbl>
     <w:sectPr>
       <w:footerReference w:type="default" r:id="rIdFooter1"/>
-      <w:footnotePr>
-        <w:numRestart w:val="eachSect"/>
-      </w:footnotePr>
       <w:pgSz w:w="12240" w:h="15840"/>
-      <w:pgMar w:top="1440" w:right="1440" w:bottom="1440" w:left="1440" w:header="720" w:footer="720" w:gutter="0"/>
+      <w:pgMar w:top="1440" w:right="1440" w:bottom="1440" w:left="1440" w:header="720" w:footer="709" w:gutter="0"/>
     </w:sectPr>
   </w:body>
 </w:document>
@@ -1901,42 +3048,21 @@
 <w:ftr xmlns:w="http://schemas.openxmlformats.org/wordprocessingml/2006/main" xmlns:r="http://schemas.openxmlformats.org/officeDocument/2006/relationships">
   <w:p>
     <w:pPr>
-      <w:spacing w:before="0" w:after="0" w:line="240" w:lineRule="auto"/>
       <w:jc w:val="center"/>
     </w:pPr>
     <w:r>
-      <w:rPr>
-        <w:sz w:val="26"/>
-        <w:szCs w:val="26"/>
-      </w:rPr>
       <w:fldChar w:fldCharType="begin"/>
     </w:r>
     <w:r>
-      <w:rPr>
-        <w:sz w:val="26"/>
-        <w:szCs w:val="26"/>
-      </w:rPr>
       <w:instrText xml:space="preserve"> PAGE </w:instrText>
     </w:r>
     <w:r>
-      <w:rPr>
-        <w:sz w:val="26"/>
-        <w:szCs w:val="26"/>
-      </w:rPr>
       <w:fldChar w:fldCharType="separate"/>
     </w:r>
     <w:r>
-      <w:rPr>
-        <w:sz w:val="26"/>
-        <w:szCs w:val="26"/>
-      </w:rPr>
       <w:t>1</w:t>
     </w:r>
     <w:r>
-      <w:rPr>
-        <w:sz w:val="26"/>
-        <w:szCs w:val="26"/>
-      </w:rPr>
       <w:fldChar w:fldCharType="end"/>
     </w:r>
   </w:p>
@@ -1959,7 +3085,7 @@
       </w:r>
     </w:p>
   </w:footnote>
-  <w:footnote w:id="15">
+  <w:footnote w:id="9">
     <w:p>
       <w:pPr>
         <w:pStyle w:val="FootnoteText"/>
@@ -1974,7 +3100,13 @@
         <w:t xml:space="preserve"> </w:t>
       </w:r>
       <w:r>
-        <w:t xml:space="preserve">Minnesota law applies to the Transfer Agreement, attached to Complaint as Ex. A, Dkt. 1-1 (“Transfer Agreement”) at ¶ 10(b). Innes does not seem to dispute this.</w:t>
+        <w:t xml:space="preserve">Minnesota law applies to the Transfer Agreement, attached to Complaint as Ex. A, Dkt. 1</w:t>
+      </w:r>
+      <w:r>
+        <w:noBreakHyphen/>
+      </w:r>
+      <w:r>
+        <w:t xml:space="preserve">1 (“Transfer Agreement”) at ¶ 10(b). Innes does not seem to dispute this.</w:t>
       </w:r>
       <w:r>
         <w:t xml:space="preserve"> </w:t>
@@ -1990,11 +3122,11 @@
         <w:t xml:space="preserve"> </w:t>
       </w:r>
       <w:r>
-        <w:t xml:space="preserve">Am. Countercl., Dkt. 34 ¶ 161.</w:t>
+        <w:t xml:space="preserve">Am. Countercl., Dkt. 34 ¶ 161.</w:t>
       </w:r>
     </w:p>
   </w:footnote>
-  <w:footnote w:id="19">
+  <w:footnote w:id="10">
     <w:p>
       <w:pPr>
         <w:pStyle w:val="FootnoteText"/>
@@ -2105,7 +3237,7 @@
   <w:docDefaults>
     <w:rPrDefault>
       <w:rPr>
-        <w:rFonts w:ascii="EB Garamond" w:hAnsi="EB Garamond" w:eastAsia="EB Garamond" w:cs="EB Garamond"/>
+        <w:rFonts w:ascii="Times New Roman" w:hAnsi="Times New Roman" w:eastAsia="Times New Roman" w:cs="Times New Roman"/>
         <w:sz w:val="26"/>
         <w:szCs w:val="26"/>
         <w:lang w:val="en-US" w:eastAsia="zh-CN" w:bidi="ar-SA"/>
@@ -2113,11 +3245,40 @@
     </w:rPrDefault>
     <w:pPrDefault>
       <w:pPr>
-        <w:spacing w:before="0" w:after="0"/>
+        <w:widowControl/>
+        <w:spacing w:after="0"/>
       </w:pPr>
     </w:pPrDefault>
   </w:docDefaults>
   <w:latentStyles w:defLockedState="0" w:defUIPriority="0" w:defSemiHidden="0" w:defUnhideWhenUsed="0" w:defQFormat="0" w:count="276"/>
+  <w:style w:type="paragraph" w:default="1" w:styleId="Normal">
+    <w:name w:val="Normal"/>
+    <w:qFormat/>
+  </w:style>
+  <w:style w:type="paragraph" w:styleId="BodyText">
+    <w:name w:val="Body Text"/>
+    <w:basedOn w:val="Normal"/>
+    <w:link w:val="BodyTextChar"/>
+    <w:qFormat/>
+    <w:pPr>
+      <w:spacing w:before="0" w:after="0" w:line="598" w:lineRule="exact"/>
+      <w:ind w:firstLine="720"/>
+    </w:pPr>
+  </w:style>
+  <w:style w:type="paragraph" w:customStyle="1" w:styleId="FirstParagraph">
+    <w:name w:val="First Paragraph"/>
+    <w:basedOn w:val="BodyText"/>
+    <w:next w:val="BodyText"/>
+    <w:qFormat/>
+  </w:style>
+  <w:style w:type="paragraph" w:customStyle="1" w:styleId="Compact">
+    <w:name w:val="Compact"/>
+    <w:basedOn w:val="BodyText"/>
+    <w:qFormat/>
+    <w:pPr>
+      <w:spacing w:before="36" w:after="36"/>
+    </w:pPr>
+  </w:style>
   <w:style w:type="paragraph" w:styleId="Title">
     <w:name w:val="Title"/>
     <w:basedOn w:val="Normal"/>
@@ -2251,6 +3412,84 @@
     <w:pPr/>
     <w:rPr/>
   </w:style>
+  <w:style w:type="paragraph" w:styleId="Heading1">
+    <w:name w:val="heading 1"/>
+    <w:basedOn w:val="Normal"/>
+    <w:next w:val="BodyText"/>
+    <w:link w:val="Heading1Char"/>
+    <w:uiPriority w:val="9"/>
+    <w:qFormat/>
+    <w:rsid w:val="00A10FD9"/>
+    <w:pPr>
+      <w:keepNext/>
+      <w:keepLines/>
+      <w:spacing w:before="299" w:after="299" w:line="299" w:lineRule="exact"/>
+      <w:ind w:firstLine="0"/>
+      <w:jc w:val="center"/>
+      <w:outlineLvl w:val="0"/>
+    </w:pPr>
+    <w:rPr>
+      <w:rFonts w:ascii="Times New Roman" w:hAnsi="Times New Roman" w:eastAsia="Times New Roman" w:cs="Times New Roman"/>
+      <w:b/>
+      <w:bCs/>
+      <w:caps/>
+      <w:color w:val="000000"/>
+      <w:sz w:val="26"/>
+      <w:szCs w:val="26"/>
+    </w:rPr>
+  </w:style>
+  <w:style w:type="paragraph" w:styleId="Heading2">
+    <w:name w:val="heading 2"/>
+    <w:basedOn w:val="Normal"/>
+    <w:next w:val="BodyText"/>
+    <w:link w:val="Heading2Char"/>
+    <w:uiPriority w:val="9"/>
+    <w:semiHidden/>
+    <w:unhideWhenUsed/>
+    <w:qFormat/>
+    <w:rsid w:val="00A10FD9"/>
+    <w:pPr>
+      <w:keepNext/>
+      <w:keepLines/>
+      <w:spacing w:before="299" w:after="299" w:line="299" w:lineRule="exact"/>
+      <w:ind w:firstLine="0"/>
+      <w:outlineLvl w:val="1"/>
+    </w:pPr>
+    <w:rPr>
+      <w:rFonts w:ascii="Times New Roman" w:hAnsi="Times New Roman" w:eastAsia="Times New Roman" w:cs="Times New Roman"/>
+      <w:b/>
+      <w:bCs/>
+      <w:color w:val="000000"/>
+      <w:sz w:val="26"/>
+      <w:szCs w:val="26"/>
+    </w:rPr>
+  </w:style>
+  <w:style w:type="paragraph" w:styleId="Heading3">
+    <w:name w:val="heading 3"/>
+    <w:basedOn w:val="Normal"/>
+    <w:next w:val="BodyText"/>
+    <w:link w:val="Heading3Char"/>
+    <w:uiPriority w:val="9"/>
+    <w:semiHidden/>
+    <w:unhideWhenUsed/>
+    <w:qFormat/>
+    <w:rsid w:val="00A10FD9"/>
+    <w:pPr>
+      <w:keepNext/>
+      <w:keepLines/>
+      <w:spacing w:before="299" w:after="299" w:line="299" w:lineRule="exact"/>
+      <w:ind w:firstLine="0"/>
+      <w:outlineLvl w:val="2"/>
+    </w:pPr>
+    <w:rPr>
+      <w:rFonts w:ascii="Times New Roman" w:hAnsi="Times New Roman" w:eastAsia="Times New Roman" w:cs="Times New Roman"/>
+      <w:b/>
+      <w:bCs/>
+      <w:color w:val="000000"/>
+      <w:sz w:val="26"/>
+      <w:szCs w:val="26"/>
+    </w:rPr>
+  </w:style>
   <w:style w:type="paragraph" w:styleId="Heading4">
     <w:name w:val="heading 4"/>
     <w:basedOn w:val="Normal"/>
@@ -2264,14 +3503,18 @@
     <w:pPr>
       <w:keepNext/>
       <w:keepLines/>
-      <w:spacing w:before="80" w:after="40"/>
+      <w:spacing w:before="299" w:after="299" w:line="299" w:lineRule="exact"/>
+      <w:ind w:firstLine="0"/>
       <w:outlineLvl w:val="3"/>
     </w:pPr>
     <w:rPr>
-      <w:rFonts w:eastAsiaTheme="majorEastAsia" w:cstheme="majorBidi"/>
+      <w:rFonts w:ascii="Times New Roman" w:hAnsi="Times New Roman" w:eastAsia="Times New Roman" w:cs="Times New Roman"/>
+      <w:b/>
+      <w:bCs/>
       <w:i/>
-      <w:iCs/>
-      <w:color w:val="0F4761" w:themeColor="accent1" w:themeShade="BF"/>
+      <w:color w:val="000000"/>
+      <w:sz w:val="26"/>
+      <w:szCs w:val="26"/>
     </w:rPr>
   </w:style>
   <w:style w:type="paragraph" w:styleId="Heading5">
@@ -2287,12 +3530,18 @@
     <w:pPr>
       <w:keepNext/>
       <w:keepLines/>
-      <w:spacing w:before="80" w:after="40"/>
+      <w:spacing w:before="299" w:after="299" w:line="299" w:lineRule="exact"/>
+      <w:ind w:firstLine="0"/>
       <w:outlineLvl w:val="4"/>
     </w:pPr>
     <w:rPr>
-      <w:rFonts w:eastAsiaTheme="majorEastAsia" w:cstheme="majorBidi"/>
-      <w:color w:val="0F4761" w:themeColor="accent1" w:themeShade="BF"/>
+      <w:rFonts w:ascii="Times New Roman" w:hAnsi="Times New Roman" w:eastAsia="Times New Roman" w:cs="Times New Roman"/>
+      <w:b/>
+      <w:bCs/>
+      <w:i/>
+      <w:color w:val="000000"/>
+      <w:sz w:val="26"/>
+      <w:szCs w:val="26"/>
     </w:rPr>
   </w:style>
   <w:style w:type="paragraph" w:styleId="Heading6">
@@ -2502,6 +3751,43 @@
       <w:color w:val="272727" w:themeColor="text1" w:themeTint="D8"/>
     </w:rPr>
   </w:style>
+  <w:style w:type="paragraph" w:customStyle="1" w:styleId="ListItem">
+    <w:name w:val="List Item"/>
+    <w:basedOn w:val="BodyText"/>
+    <w:qFormat/>
+    <w:pPr>
+      <w:spacing w:before="0" w:after="0" w:line="598" w:lineRule="exact"/>
+      <w:ind w:left="720" w:hanging="720"/>
+    </w:pPr>
+  </w:style>
+  <w:style w:type="paragraph" w:styleId="BlockText">
+    <w:name w:val="Block Text"/>
+    <w:basedOn w:val="BodyText"/>
+    <w:next w:val="BodyText"/>
+    <w:uiPriority w:val="9"/>
+    <w:unhideWhenUsed/>
+    <w:qFormat/>
+    <w:pPr>
+      <w:spacing w:before="299" w:after="299" w:line="299" w:lineRule="exact"/>
+      <w:ind w:firstLine="0" w:left="720" w:right="720"/>
+    </w:pPr>
+  </w:style>
+  <w:style w:type="paragraph" w:styleId="FootnoteText">
+    <w:name w:val="Footnote Text"/>
+    <w:basedOn w:val="Normal"/>
+    <w:next w:val="FootnoteText"/>
+    <w:uiPriority w:val="9"/>
+    <w:unhideWhenUsed/>
+    <w:qFormat/>
+    <w:pPr>
+      <w:keepLines/>
+      <w:spacing w:before="0" w:after="140" w:line="299" w:lineRule="exact"/>
+    </w:pPr>
+    <w:rPr>
+      <w:sz w:val="26"/>
+      <w:szCs w:val="26"/>
+    </w:rPr>
+  </w:style>
   <w:style w:type="paragraph" w:styleId="FootnoteBlockText">
     <w:name w:val="Footnote Block Text"/>
     <w:basedOn w:val="FootnoteText"/>
@@ -2510,8 +3796,8 @@
     <w:unhideWhenUsed/>
     <w:qFormat/>
     <w:pPr>
-      <w:spacing w:before="100" w:after="100"/>
-      <w:ind w:firstLine="0" w:left="480" w:right="480"/>
+      <w:spacing w:before="299" w:after="299"/>
+      <w:ind w:firstLine="0" w:left="720" w:right="720"/>
     </w:pPr>
   </w:style>
   <w:style w:type="character" w:default="1" w:styleId="DefaultParagraphFont">
@@ -2619,7 +3905,7 @@
     <w:name w:val="Hyperlink"/>
     <w:basedOn w:val="BodyTextChar"/>
     <w:rPr>
-      <w:color w:val="4F81BD" w:themeColor="accent1"/>
+      <w:color w:val="000000"/>
     </w:rPr>
   </w:style>
   <w:style w:type="paragraph" w:styleId="TOCHeading">
@@ -2638,147 +3924,6 @@
       <w:b w:val="0"/>
       <w:bCs w:val="0"/>
       <w:color w:val="365F91" w:themeColor="accent1" w:themeShade="BF"/>
-    </w:rPr>
-  </w:style>
-  <w:style w:type="paragraph" w:default="1" w:styleId="Normal">
-    <w:name w:val="Normal"/>
-    <w:qFormat/>
-    <w:pPr>
-      <w:widowControl/>
-      <w:spacing w:before="0" w:after="0" w:line="598" w:lineRule="exact"/>
-    </w:pPr>
-    <w:rPr>
-      <w:rFonts w:ascii="EB Garamond" w:hAnsi="EB Garamond" w:eastAsia="EB Garamond" w:cs="EB Garamond"/>
-      <w:color w:val="000000"/>
-      <w:sz w:val="26"/>
-      <w:szCs w:val="26"/>
-    </w:rPr>
-  </w:style>
-  <w:style w:type="paragraph" w:styleId="BodyText">
-    <w:name w:val="Body Text"/>
-    <w:basedOn w:val="Normal"/>
-    <w:link w:val="BodyTextChar"/>
-    <w:qFormat/>
-    <w:pPr>
-      <w:spacing w:before="0" w:after="0" w:line="598" w:lineRule="exact"/>
-      <w:ind w:firstLine="720"/>
-      <w:jc w:val="both"/>
-    </w:pPr>
-  </w:style>
-  <w:style w:type="paragraph" w:customStyle="1" w:styleId="FirstParagraph">
-    <w:name w:val="First Paragraph"/>
-    <w:basedOn w:val="BodyText"/>
-    <w:next w:val="BodyText"/>
-    <w:qFormat/>
-    <w:pPr>
-      <w:ind w:firstLine="0"/>
-    </w:pPr>
-  </w:style>
-  <w:style w:type="paragraph" w:customStyle="1" w:styleId="Compact">
-    <w:name w:val="Compact"/>
-    <w:basedOn w:val="BodyText"/>
-    <w:qFormat/>
-    <w:pPr>
-      <w:spacing w:before="0" w:after="0" w:line="598" w:lineRule="exact"/>
-      <w:ind w:firstLine="0"/>
-      <w:jc w:val="left"/>
-    </w:pPr>
-  </w:style>
-  <w:style w:type="paragraph" w:styleId="Heading1">
-    <w:name w:val="heading 1"/>
-    <w:basedOn w:val="Normal"/>
-    <w:next w:val="BodyText"/>
-    <w:link w:val="Heading1Char"/>
-    <w:uiPriority w:val="9"/>
-    <w:qFormat/>
-    <w:pPr>
-      <w:keepNext/>
-      <w:keepLines/>
-      <w:spacing w:before="86" w:after="86" w:line="598" w:lineRule="exact"/>
-      <w:ind w:firstLine="0"/>
-      <w:jc w:val="center"/>
-      <w:outlineLvl w:val="0"/>
-    </w:pPr>
-    <w:rPr>
-      <w:b/>
-      <w:bCs/>
-      <w:color w:val="000000"/>
-      <w:sz w:val="26"/>
-      <w:szCs w:val="26"/>
-    </w:rPr>
-  </w:style>
-  <w:style w:type="paragraph" w:styleId="Heading2">
-    <w:name w:val="heading 2"/>
-    <w:basedOn w:val="Normal"/>
-    <w:next w:val="BodyText"/>
-    <w:link w:val="Heading2Char"/>
-    <w:uiPriority w:val="9"/>
-    <w:unhideWhenUsed/>
-    <w:qFormat/>
-    <w:pPr>
-      <w:keepNext/>
-      <w:keepLines/>
-      <w:spacing w:before="86" w:after="86" w:line="299" w:lineRule="exact"/>
-      <w:ind w:left="720" w:hanging="720"/>
-      <w:jc w:val="left"/>
-      <w:outlineLvl w:val="1"/>
-    </w:pPr>
-    <w:rPr>
-      <w:b/>
-      <w:bCs/>
-      <w:color w:val="000000"/>
-      <w:sz w:val="26"/>
-      <w:szCs w:val="26"/>
-    </w:rPr>
-  </w:style>
-  <w:style w:type="paragraph" w:styleId="Heading3">
-    <w:name w:val="heading 3"/>
-    <w:basedOn w:val="Normal"/>
-    <w:next w:val="BodyText"/>
-    <w:link w:val="Heading3Char"/>
-    <w:uiPriority w:val="9"/>
-    <w:unhideWhenUsed/>
-    <w:qFormat/>
-    <w:pPr>
-      <w:keepNext/>
-      <w:keepLines/>
-      <w:spacing w:before="86" w:after="86" w:line="299" w:lineRule="exact"/>
-      <w:ind w:left="1440" w:hanging="720"/>
-      <w:jc w:val="left"/>
-      <w:outlineLvl w:val="2"/>
-    </w:pPr>
-    <w:rPr>
-      <w:b/>
-      <w:bCs/>
-      <w:color w:val="000000"/>
-      <w:sz w:val="26"/>
-      <w:szCs w:val="26"/>
-    </w:rPr>
-  </w:style>
-  <w:style w:type="paragraph" w:styleId="BlockText">
-    <w:name w:val="Block Text"/>
-    <w:basedOn w:val="BodyText"/>
-    <w:next w:val="BodyText"/>
-    <w:uiPriority w:val="9"/>
-    <w:unhideWhenUsed/>
-    <w:qFormat/>
-    <w:pPr>
-      <w:spacing w:before="86" w:after="86" w:line="299" w:lineRule="exact"/>
-      <w:ind w:firstLine="0" w:left="720" w:right="720"/>
-    </w:pPr>
-  </w:style>
-  <w:style w:type="paragraph" w:styleId="FootnoteText">
-    <w:name w:val="footnote text"/>
-    <w:basedOn w:val="Normal"/>
-    <w:uiPriority w:val="99"/>
-    <w:unhideWhenUsed/>
-    <w:pPr>
-      <w:spacing w:before="0" w:after="60" w:line="299" w:lineRule="exact"/>
-      <w:jc w:val="both"/>
-    </w:pPr>
-    <w:rPr>
-      <w:sz w:val="26"/>
-      <w:szCs w:val="26"/>
     </w:rPr>
   </w:style>
   <w:style w:type="paragraph" w:customStyle="1" w:styleId="SourceCode">

</xml_diff>